<commit_message>
Refine README content and report
Update README to clarify S.I.R.A. project scope and security approach: simplify the project title, revise keywords, rename 'Project Vision' to 'Project Description', and clarify cloud infrastructure usage. Describe a strict two-tier security pipeline (local regex PII sanitisation before LLM processing and Fernet/AES encryption for stored incident records), adjust phrasing for consistency (e.g. 'Centre', 'organisational resilience'), and make minor editorial improvements. Also update the binary report.docx.
</commit_message>
<xml_diff>
--- a/Documentation/report.docx
+++ b/Documentation/report.docx
@@ -5,7 +5,11 @@
     <w:sdt>
       <w:sdtPr>
         <w:rPr>
+          <w:rFonts w:asciiTheme="majorHAnsi" w:eastAsiaTheme="majorEastAsia" w:hAnsiTheme="majorHAnsi" w:cstheme="majorBidi"/>
+          <w:color w:val="2F5496" w:themeColor="accent1" w:themeShade="BF"/>
           <w:sz w:val="2"/>
+          <w:szCs w:val="40"/>
+          <w:lang w:val="en-GB"/>
         </w:rPr>
         <w:id w:val="189736493"/>
         <w:docPartObj>
@@ -15,11 +19,10 @@
       </w:sdtPr>
       <w:sdtEndPr>
         <w:rPr>
-          <w:rFonts w:asciiTheme="majorHAnsi" w:eastAsiaTheme="majorEastAsia" w:hAnsiTheme="majorHAnsi" w:cstheme="majorBidi"/>
-          <w:color w:val="2F5496" w:themeColor="accent1" w:themeShade="BF"/>
-          <w:sz w:val="40"/>
-          <w:szCs w:val="40"/>
-          <w:lang w:val="en-GB"/>
+          <w:rFonts w:asciiTheme="minorHAnsi" w:eastAsiaTheme="minorHAnsi" w:hAnsiTheme="minorHAnsi" w:cstheme="minorBidi"/>
+          <w:color w:val="auto"/>
+          <w:sz w:val="22"/>
+          <w:szCs w:val="22"/>
         </w:rPr>
       </w:sdtEndPr>
       <w:sdtContent>
@@ -32,1011 +35,116 @@
           </w:pPr>
         </w:p>
         <w:p>
+          <w:pPr>
+            <w:pStyle w:val="Title"/>
+            <w:jc w:val="center"/>
+            <w:rPr>
+              <w:b/>
+              <w:bCs/>
+              <w:sz w:val="72"/>
+              <w:szCs w:val="72"/>
+            </w:rPr>
+          </w:pPr>
           <w:r>
             <w:rPr>
-              <w:noProof/>
+              <w:b/>
+              <w:bCs/>
+              <w:sz w:val="72"/>
+              <w:szCs w:val="72"/>
             </w:rPr>
-            <mc:AlternateContent>
-              <mc:Choice Requires="wps">
-                <w:drawing>
-                  <wp:anchor distT="0" distB="0" distL="114300" distR="114300" simplePos="0" relativeHeight="251661312" behindDoc="0" locked="0" layoutInCell="1" allowOverlap="1" wp14:anchorId="284A5D24" wp14:editId="47E3EB5F">
-                    <wp:simplePos x="0" y="0"/>
-                    <wp:positionH relativeFrom="page">
-                      <wp:align>center</wp:align>
-                    </wp:positionH>
-                    <wp:positionV relativeFrom="margin">
-                      <wp:align>top</wp:align>
-                    </wp:positionV>
-                    <wp:extent cx="5943600" cy="914400"/>
-                    <wp:effectExtent l="0" t="0" r="0" b="3810"/>
-                    <wp:wrapNone/>
-                    <wp:docPr id="62" name="Text Box 66"/>
-                    <wp:cNvGraphicFramePr/>
-                    <a:graphic xmlns:a="http://schemas.openxmlformats.org/drawingml/2006/main">
-                      <a:graphicData uri="http://schemas.microsoft.com/office/word/2010/wordprocessingShape">
-                        <wps:wsp>
-                          <wps:cNvSpPr txBox="1"/>
-                          <wps:spPr>
-                            <a:xfrm>
-                              <a:off x="0" y="0"/>
-                              <a:ext cx="5943600" cy="914400"/>
-                            </a:xfrm>
-                            <a:prstGeom prst="rect">
-                              <a:avLst/>
-                            </a:prstGeom>
-                            <a:noFill/>
-                            <a:ln w="6350">
-                              <a:noFill/>
-                            </a:ln>
-                            <a:effectLst/>
-                          </wps:spPr>
-                          <wps:style>
-                            <a:lnRef idx="0">
-                              <a:schemeClr val="accent1"/>
-                            </a:lnRef>
-                            <a:fillRef idx="0">
-                              <a:schemeClr val="accent1"/>
-                            </a:fillRef>
-                            <a:effectRef idx="0">
-                              <a:schemeClr val="accent1"/>
-                            </a:effectRef>
-                            <a:fontRef idx="minor">
-                              <a:schemeClr val="dk1"/>
-                            </a:fontRef>
-                          </wps:style>
-                          <wps:txbx>
-                            <w:txbxContent>
-                              <w:sdt>
-                                <w:sdtPr>
-                                  <w:alias w:val="Title"/>
-                                  <w:tag w:val=""/>
-                                  <w:id w:val="797192764"/>
-                                  <w:dataBinding w:prefixMappings="xmlns:ns0='http://purl.org/dc/elements/1.1/' xmlns:ns1='http://schemas.openxmlformats.org/package/2006/metadata/core-properties' " w:xpath="/ns1:coreProperties[1]/ns0:title[1]" w:storeItemID="{6C3C8BC8-F283-45AE-878A-BAB7291924A1}"/>
-                                  <w:text/>
-                                </w:sdtPr>
-                                <w:sdtContent>
-                                  <w:p>
-                                    <w:pPr>
-                                      <w:pStyle w:val="NoSpacing"/>
-                                      <w:rPr>
-                                        <w:rFonts w:asciiTheme="majorHAnsi" w:eastAsiaTheme="majorEastAsia" w:hAnsiTheme="majorHAnsi" w:cstheme="majorBidi"/>
-                                        <w:caps/>
-                                        <w:color w:val="8496B0" w:themeColor="text2" w:themeTint="99"/>
-                                        <w:sz w:val="68"/>
-                                        <w:szCs w:val="68"/>
-                                      </w:rPr>
-                                    </w:pPr>
-                                    <w:r>
-                                      <w:t>Project title</w:t>
-                                    </w:r>
-                                  </w:p>
-                                </w:sdtContent>
-                              </w:sdt>
-                              <w:p>
-                                <w:pPr>
-                                  <w:pStyle w:val="NoSpacing"/>
-                                  <w:spacing w:before="120"/>
-                                  <w:rPr>
-                                    <w:color w:val="4472C4" w:themeColor="accent1"/>
-                                    <w:sz w:val="36"/>
-                                    <w:szCs w:val="36"/>
-                                  </w:rPr>
-                                </w:pPr>
-                                <w:sdt>
-                                  <w:sdtPr>
-                                    <w:rPr>
-                                      <w:color w:val="4472C4" w:themeColor="accent1"/>
-                                      <w:sz w:val="36"/>
-                                      <w:szCs w:val="36"/>
-                                    </w:rPr>
-                                    <w:alias w:val="Subtitle"/>
-                                    <w:tag w:val=""/>
-                                    <w:id w:val="2021743002"/>
-                                    <w:dataBinding w:prefixMappings="xmlns:ns0='http://purl.org/dc/elements/1.1/' xmlns:ns1='http://schemas.openxmlformats.org/package/2006/metadata/core-properties' " w:xpath="/ns1:coreProperties[1]/ns0:subject[1]" w:storeItemID="{6C3C8BC8-F283-45AE-878A-BAB7291924A1}"/>
-                                    <w:text/>
-                                  </w:sdtPr>
-                                  <w:sdtContent>
-                                    <w:r>
-                                      <w:rPr>
-                                        <w:color w:val="4472C4" w:themeColor="accent1"/>
-                                        <w:sz w:val="36"/>
-                                        <w:szCs w:val="36"/>
-                                      </w:rPr>
-                                      <w:t xml:space="preserve">COMP3000 </w:t>
-                                    </w:r>
-                                    <w:r>
-                                      <w:rPr>
-                                        <w:color w:val="4472C4" w:themeColor="accent1"/>
-                                        <w:sz w:val="36"/>
-                                        <w:szCs w:val="36"/>
-                                      </w:rPr>
-                                      <w:t>Computing Project</w:t>
-                                    </w:r>
-                                  </w:sdtContent>
-                                </w:sdt>
-                                <w:r>
-                                  <w:rPr>
-                                    <w:noProof/>
-                                  </w:rPr>
-                                  <w:t xml:space="preserve"> </w:t>
-                                </w:r>
-                              </w:p>
-                              <w:p/>
-                            </w:txbxContent>
-                          </wps:txbx>
-                          <wps:bodyPr rot="0" spcFirstLastPara="0" vertOverflow="overflow" horzOverflow="overflow" vert="horz" wrap="square" lIns="91440" tIns="45720" rIns="91440" bIns="45720" numCol="1" spcCol="0" rtlCol="0" fromWordArt="0" anchor="t" anchorCtr="0" forceAA="0" compatLnSpc="1">
-                            <a:prstTxWarp prst="textNoShape">
-                              <a:avLst/>
-                            </a:prstTxWarp>
-                            <a:spAutoFit/>
-                          </wps:bodyPr>
-                        </wps:wsp>
-                      </a:graphicData>
-                    </a:graphic>
-                    <wp14:sizeRelH relativeFrom="page">
-                      <wp14:pctWidth>76500</wp14:pctWidth>
-                    </wp14:sizeRelH>
-                  </wp:anchor>
-                </w:drawing>
-              </mc:Choice>
-              <mc:Fallback>
-                <w:pict>
-                  <v:shapetype w14:anchorId="284A5D24" id="_x0000_t202" coordsize="21600,21600" o:spt="202" path="m,l,21600r21600,l21600,xe">
-                    <v:stroke joinstyle="miter"/>
-                    <v:path gradientshapeok="t" o:connecttype="rect"/>
-                  </v:shapetype>
-                  <v:shape id="Text Box 66" o:spid="_x0000_s1026" type="#_x0000_t202" style="position:absolute;margin-left:0;margin-top:0;width:468pt;height:1in;z-index:251661312;visibility:visible;mso-wrap-style:square;mso-width-percent:765;mso-wrap-distance-left:9pt;mso-wrap-distance-top:0;mso-wrap-distance-right:9pt;mso-wrap-distance-bottom:0;mso-position-horizontal:center;mso-position-horizontal-relative:page;mso-position-vertical:top;mso-position-vertical-relative:margin;mso-width-percent:765;mso-width-relative:page;v-text-anchor:top" o:gfxdata="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" filled="f" stroked="f" strokeweight=".5pt">
-                    <v:textbox style="mso-fit-shape-to-text:t">
-                      <w:txbxContent>
-                        <w:sdt>
-                          <w:sdtPr>
-                            <w:alias w:val="Title"/>
-                            <w:tag w:val=""/>
-                            <w:id w:val="797192764"/>
-                            <w:dataBinding w:prefixMappings="xmlns:ns0='http://purl.org/dc/elements/1.1/' xmlns:ns1='http://schemas.openxmlformats.org/package/2006/metadata/core-properties' " w:xpath="/ns1:coreProperties[1]/ns0:title[1]" w:storeItemID="{6C3C8BC8-F283-45AE-878A-BAB7291924A1}"/>
-                            <w:text/>
-                          </w:sdtPr>
-                          <w:sdtContent>
-                            <w:p>
-                              <w:pPr>
-                                <w:pStyle w:val="NoSpacing"/>
-                                <w:rPr>
-                                  <w:rFonts w:asciiTheme="majorHAnsi" w:eastAsiaTheme="majorEastAsia" w:hAnsiTheme="majorHAnsi" w:cstheme="majorBidi"/>
-                                  <w:caps/>
-                                  <w:color w:val="8496B0" w:themeColor="text2" w:themeTint="99"/>
-                                  <w:sz w:val="68"/>
-                                  <w:szCs w:val="68"/>
-                                </w:rPr>
-                              </w:pPr>
-                              <w:r>
-                                <w:t>Project title</w:t>
-                              </w:r>
-                            </w:p>
-                          </w:sdtContent>
-                        </w:sdt>
-                        <w:p>
-                          <w:pPr>
-                            <w:pStyle w:val="NoSpacing"/>
-                            <w:spacing w:before="120"/>
-                            <w:rPr>
-                              <w:color w:val="4472C4" w:themeColor="accent1"/>
-                              <w:sz w:val="36"/>
-                              <w:szCs w:val="36"/>
-                            </w:rPr>
-                          </w:pPr>
-                          <w:sdt>
-                            <w:sdtPr>
-                              <w:rPr>
-                                <w:color w:val="4472C4" w:themeColor="accent1"/>
-                                <w:sz w:val="36"/>
-                                <w:szCs w:val="36"/>
-                              </w:rPr>
-                              <w:alias w:val="Subtitle"/>
-                              <w:tag w:val=""/>
-                              <w:id w:val="2021743002"/>
-                              <w:dataBinding w:prefixMappings="xmlns:ns0='http://purl.org/dc/elements/1.1/' xmlns:ns1='http://schemas.openxmlformats.org/package/2006/metadata/core-properties' " w:xpath="/ns1:coreProperties[1]/ns0:subject[1]" w:storeItemID="{6C3C8BC8-F283-45AE-878A-BAB7291924A1}"/>
-                              <w:text/>
-                            </w:sdtPr>
-                            <w:sdtContent>
-                              <w:r>
-                                <w:rPr>
-                                  <w:color w:val="4472C4" w:themeColor="accent1"/>
-                                  <w:sz w:val="36"/>
-                                  <w:szCs w:val="36"/>
-                                </w:rPr>
-                                <w:t xml:space="preserve">COMP3000 </w:t>
-                              </w:r>
-                              <w:r>
-                                <w:rPr>
-                                  <w:color w:val="4472C4" w:themeColor="accent1"/>
-                                  <w:sz w:val="36"/>
-                                  <w:szCs w:val="36"/>
-                                </w:rPr>
-                                <w:t>Computing Project</w:t>
-                              </w:r>
-                            </w:sdtContent>
-                          </w:sdt>
-                          <w:r>
-                            <w:rPr>
-                              <w:noProof/>
-                            </w:rPr>
-                            <w:t xml:space="preserve"> </w:t>
-                          </w:r>
-                        </w:p>
-                        <w:p/>
-                      </w:txbxContent>
-                    </v:textbox>
-                    <w10:wrap anchorx="page" anchory="margin"/>
-                  </v:shape>
-                </w:pict>
-              </mc:Fallback>
-            </mc:AlternateContent>
+            <w:t>University of Plymouth</w:t>
           </w:r>
+        </w:p>
+        <w:p/>
+        <w:p>
+          <w:pPr>
+            <w:pStyle w:val="Title"/>
+            <w:jc w:val="center"/>
+            <w:rPr>
+              <w:sz w:val="52"/>
+              <w:szCs w:val="52"/>
+            </w:rPr>
+          </w:pPr>
           <w:r>
             <w:rPr>
-              <w:noProof/>
-              <w:color w:val="4472C4" w:themeColor="accent1"/>
-              <w:sz w:val="36"/>
-              <w:szCs w:val="36"/>
+              <w:sz w:val="52"/>
+              <w:szCs w:val="52"/>
             </w:rPr>
-            <mc:AlternateContent>
-              <mc:Choice Requires="wpg">
-                <w:drawing>
-                  <wp:anchor distT="0" distB="0" distL="114300" distR="114300" simplePos="0" relativeHeight="251660288" behindDoc="1" locked="0" layoutInCell="1" allowOverlap="1" wp14:anchorId="0DC96552" wp14:editId="0240AB0C">
-                    <wp:simplePos x="0" y="0"/>
-                    <mc:AlternateContent>
-                      <mc:Choice Requires="wp14">
-                        <wp:positionH relativeFrom="page">
-                          <wp14:pctPosHOffset>22000</wp14:pctPosHOffset>
-                        </wp:positionH>
-                      </mc:Choice>
-                      <mc:Fallback>
-                        <wp:positionH relativeFrom="page">
-                          <wp:posOffset>1663065</wp:posOffset>
-                        </wp:positionH>
-                      </mc:Fallback>
-                    </mc:AlternateContent>
-                    <mc:AlternateContent>
-                      <mc:Choice Requires="wp14">
-                        <wp:positionV relativeFrom="page">
-                          <wp14:pctPosVOffset>30000</wp14:pctPosVOffset>
-                        </wp:positionV>
-                      </mc:Choice>
-                      <mc:Fallback>
-                        <wp:positionV relativeFrom="page">
-                          <wp:posOffset>3207385</wp:posOffset>
-                        </wp:positionV>
-                      </mc:Fallback>
-                    </mc:AlternateContent>
-                    <wp:extent cx="5494369" cy="5696712"/>
-                    <wp:effectExtent l="0" t="0" r="0" b="3175"/>
-                    <wp:wrapNone/>
-                    <wp:docPr id="63" name="Group 2"/>
-                    <wp:cNvGraphicFramePr>
-                      <a:graphicFrameLocks xmlns:a="http://schemas.openxmlformats.org/drawingml/2006/main" noChangeAspect="1"/>
-                    </wp:cNvGraphicFramePr>
-                    <a:graphic xmlns:a="http://schemas.openxmlformats.org/drawingml/2006/main">
-                      <a:graphicData uri="http://schemas.microsoft.com/office/word/2010/wordprocessingGroup">
-                        <wpg:wgp>
-                          <wpg:cNvGrpSpPr>
-                            <a:grpSpLocks noChangeAspect="1"/>
-                          </wpg:cNvGrpSpPr>
-                          <wpg:grpSpPr>
-                            <a:xfrm>
-                              <a:off x="0" y="0"/>
-                              <a:ext cx="5494369" cy="5696712"/>
-                              <a:chOff x="0" y="0"/>
-                              <a:chExt cx="4329113" cy="4491038"/>
-                            </a:xfrm>
-                            <a:solidFill>
-                              <a:schemeClr val="tx2">
-                                <a:lumMod val="60000"/>
-                                <a:lumOff val="40000"/>
-                              </a:schemeClr>
-                            </a:solidFill>
-                          </wpg:grpSpPr>
-                          <wps:wsp>
-                            <wps:cNvPr id="64" name="Freeform 64"/>
-                            <wps:cNvSpPr>
-                              <a:spLocks/>
-                            </wps:cNvSpPr>
-                            <wps:spPr bwMode="auto">
-                              <a:xfrm>
-                                <a:off x="1501775" y="0"/>
-                                <a:ext cx="2827338" cy="2835275"/>
-                              </a:xfrm>
-                              <a:custGeom>
-                                <a:avLst/>
-                                <a:gdLst>
-                                  <a:gd name="T0" fmla="*/ 4 w 1781"/>
-                                  <a:gd name="T1" fmla="*/ 1786 h 1786"/>
-                                  <a:gd name="T2" fmla="*/ 0 w 1781"/>
-                                  <a:gd name="T3" fmla="*/ 1782 h 1786"/>
-                                  <a:gd name="T4" fmla="*/ 1776 w 1781"/>
-                                  <a:gd name="T5" fmla="*/ 0 h 1786"/>
-                                  <a:gd name="T6" fmla="*/ 1781 w 1781"/>
-                                  <a:gd name="T7" fmla="*/ 5 h 1786"/>
-                                  <a:gd name="T8" fmla="*/ 4 w 1781"/>
-                                  <a:gd name="T9" fmla="*/ 1786 h 1786"/>
-                                </a:gdLst>
-                                <a:ahLst/>
-                                <a:cxnLst>
-                                  <a:cxn ang="0">
-                                    <a:pos x="T0" y="T1"/>
-                                  </a:cxn>
-                                  <a:cxn ang="0">
-                                    <a:pos x="T2" y="T3"/>
-                                  </a:cxn>
-                                  <a:cxn ang="0">
-                                    <a:pos x="T4" y="T5"/>
-                                  </a:cxn>
-                                  <a:cxn ang="0">
-                                    <a:pos x="T6" y="T7"/>
-                                  </a:cxn>
-                                  <a:cxn ang="0">
-                                    <a:pos x="T8" y="T9"/>
-                                  </a:cxn>
-                                </a:cxnLst>
-                                <a:rect l="0" t="0" r="r" b="b"/>
-                                <a:pathLst>
-                                  <a:path w="1781" h="1786">
-                                    <a:moveTo>
-                                      <a:pt x="4" y="1786"/>
-                                    </a:moveTo>
-                                    <a:lnTo>
-                                      <a:pt x="0" y="1782"/>
-                                    </a:lnTo>
-                                    <a:lnTo>
-                                      <a:pt x="1776" y="0"/>
-                                    </a:lnTo>
-                                    <a:lnTo>
-                                      <a:pt x="1781" y="5"/>
-                                    </a:lnTo>
-                                    <a:lnTo>
-                                      <a:pt x="4" y="1786"/>
-                                    </a:lnTo>
-                                    <a:close/>
-                                  </a:path>
-                                </a:pathLst>
-                              </a:custGeom>
-                              <a:grpFill/>
-                              <a:ln>
-                                <a:noFill/>
-                              </a:ln>
-                              <a:extLst>
-                                <a:ext uri="{91240B29-F687-4F45-9708-019B960494DF}">
-                                  <a14:hiddenLine xmlns:a14="http://schemas.microsoft.com/office/drawing/2010/main" w="9525">
-                                    <a:solidFill>
-                                      <a:srgbClr val="000000"/>
-                                    </a:solidFill>
-                                    <a:round/>
-                                    <a:headEnd/>
-                                    <a:tailEnd/>
-                                  </a14:hiddenLine>
-                                </a:ext>
-                              </a:extLst>
-                            </wps:spPr>
-                            <wps:bodyPr vert="horz" wrap="square" lIns="91440" tIns="45720" rIns="91440" bIns="45720" numCol="1" anchor="t" anchorCtr="0" compatLnSpc="1">
-                              <a:prstTxWarp prst="textNoShape">
-                                <a:avLst/>
-                              </a:prstTxWarp>
-                            </wps:bodyPr>
-                          </wps:wsp>
-                          <wps:wsp>
-                            <wps:cNvPr id="65" name="Freeform 65"/>
-                            <wps:cNvSpPr>
-                              <a:spLocks/>
-                            </wps:cNvSpPr>
-                            <wps:spPr bwMode="auto">
-                              <a:xfrm>
-                                <a:off x="782637" y="227013"/>
-                                <a:ext cx="3546475" cy="3546475"/>
-                              </a:xfrm>
-                              <a:custGeom>
-                                <a:avLst/>
-                                <a:gdLst>
-                                  <a:gd name="T0" fmla="*/ 5 w 2234"/>
-                                  <a:gd name="T1" fmla="*/ 2234 h 2234"/>
-                                  <a:gd name="T2" fmla="*/ 0 w 2234"/>
-                                  <a:gd name="T3" fmla="*/ 2229 h 2234"/>
-                                  <a:gd name="T4" fmla="*/ 2229 w 2234"/>
-                                  <a:gd name="T5" fmla="*/ 0 h 2234"/>
-                                  <a:gd name="T6" fmla="*/ 2234 w 2234"/>
-                                  <a:gd name="T7" fmla="*/ 5 h 2234"/>
-                                  <a:gd name="T8" fmla="*/ 5 w 2234"/>
-                                  <a:gd name="T9" fmla="*/ 2234 h 2234"/>
-                                </a:gdLst>
-                                <a:ahLst/>
-                                <a:cxnLst>
-                                  <a:cxn ang="0">
-                                    <a:pos x="T0" y="T1"/>
-                                  </a:cxn>
-                                  <a:cxn ang="0">
-                                    <a:pos x="T2" y="T3"/>
-                                  </a:cxn>
-                                  <a:cxn ang="0">
-                                    <a:pos x="T4" y="T5"/>
-                                  </a:cxn>
-                                  <a:cxn ang="0">
-                                    <a:pos x="T6" y="T7"/>
-                                  </a:cxn>
-                                  <a:cxn ang="0">
-                                    <a:pos x="T8" y="T9"/>
-                                  </a:cxn>
-                                </a:cxnLst>
-                                <a:rect l="0" t="0" r="r" b="b"/>
-                                <a:pathLst>
-                                  <a:path w="2234" h="2234">
-                                    <a:moveTo>
-                                      <a:pt x="5" y="2234"/>
-                                    </a:moveTo>
-                                    <a:lnTo>
-                                      <a:pt x="0" y="2229"/>
-                                    </a:lnTo>
-                                    <a:lnTo>
-                                      <a:pt x="2229" y="0"/>
-                                    </a:lnTo>
-                                    <a:lnTo>
-                                      <a:pt x="2234" y="5"/>
-                                    </a:lnTo>
-                                    <a:lnTo>
-                                      <a:pt x="5" y="2234"/>
-                                    </a:lnTo>
-                                    <a:close/>
-                                  </a:path>
-                                </a:pathLst>
-                              </a:custGeom>
-                              <a:grpFill/>
-                              <a:ln>
-                                <a:noFill/>
-                              </a:ln>
-                              <a:extLst>
-                                <a:ext uri="{91240B29-F687-4F45-9708-019B960494DF}">
-                                  <a14:hiddenLine xmlns:a14="http://schemas.microsoft.com/office/drawing/2010/main" w="9525">
-                                    <a:solidFill>
-                                      <a:srgbClr val="000000"/>
-                                    </a:solidFill>
-                                    <a:round/>
-                                    <a:headEnd/>
-                                    <a:tailEnd/>
-                                  </a14:hiddenLine>
-                                </a:ext>
-                              </a:extLst>
-                            </wps:spPr>
-                            <wps:bodyPr vert="horz" wrap="square" lIns="91440" tIns="45720" rIns="91440" bIns="45720" numCol="1" anchor="t" anchorCtr="0" compatLnSpc="1">
-                              <a:prstTxWarp prst="textNoShape">
-                                <a:avLst/>
-                              </a:prstTxWarp>
-                            </wps:bodyPr>
-                          </wps:wsp>
-                          <wps:wsp>
-                            <wps:cNvPr id="66" name="Freeform 66"/>
-                            <wps:cNvSpPr>
-                              <a:spLocks/>
-                            </wps:cNvSpPr>
-                            <wps:spPr bwMode="auto">
-                              <a:xfrm>
-                                <a:off x="841375" y="109538"/>
-                                <a:ext cx="3487738" cy="3487738"/>
-                              </a:xfrm>
-                              <a:custGeom>
-                                <a:avLst/>
-                                <a:gdLst>
-                                  <a:gd name="T0" fmla="*/ 9 w 2197"/>
-                                  <a:gd name="T1" fmla="*/ 2197 h 2197"/>
-                                  <a:gd name="T2" fmla="*/ 0 w 2197"/>
-                                  <a:gd name="T3" fmla="*/ 2193 h 2197"/>
-                                  <a:gd name="T4" fmla="*/ 2188 w 2197"/>
-                                  <a:gd name="T5" fmla="*/ 0 h 2197"/>
-                                  <a:gd name="T6" fmla="*/ 2197 w 2197"/>
-                                  <a:gd name="T7" fmla="*/ 10 h 2197"/>
-                                  <a:gd name="T8" fmla="*/ 9 w 2197"/>
-                                  <a:gd name="T9" fmla="*/ 2197 h 2197"/>
-                                </a:gdLst>
-                                <a:ahLst/>
-                                <a:cxnLst>
-                                  <a:cxn ang="0">
-                                    <a:pos x="T0" y="T1"/>
-                                  </a:cxn>
-                                  <a:cxn ang="0">
-                                    <a:pos x="T2" y="T3"/>
-                                  </a:cxn>
-                                  <a:cxn ang="0">
-                                    <a:pos x="T4" y="T5"/>
-                                  </a:cxn>
-                                  <a:cxn ang="0">
-                                    <a:pos x="T6" y="T7"/>
-                                  </a:cxn>
-                                  <a:cxn ang="0">
-                                    <a:pos x="T8" y="T9"/>
-                                  </a:cxn>
-                                </a:cxnLst>
-                                <a:rect l="0" t="0" r="r" b="b"/>
-                                <a:pathLst>
-                                  <a:path w="2197" h="2197">
-                                    <a:moveTo>
-                                      <a:pt x="9" y="2197"/>
-                                    </a:moveTo>
-                                    <a:lnTo>
-                                      <a:pt x="0" y="2193"/>
-                                    </a:lnTo>
-                                    <a:lnTo>
-                                      <a:pt x="2188" y="0"/>
-                                    </a:lnTo>
-                                    <a:lnTo>
-                                      <a:pt x="2197" y="10"/>
-                                    </a:lnTo>
-                                    <a:lnTo>
-                                      <a:pt x="9" y="2197"/>
-                                    </a:lnTo>
-                                    <a:close/>
-                                  </a:path>
-                                </a:pathLst>
-                              </a:custGeom>
-                              <a:grpFill/>
-                              <a:ln>
-                                <a:noFill/>
-                              </a:ln>
-                              <a:extLst>
-                                <a:ext uri="{91240B29-F687-4F45-9708-019B960494DF}">
-                                  <a14:hiddenLine xmlns:a14="http://schemas.microsoft.com/office/drawing/2010/main" w="9525">
-                                    <a:solidFill>
-                                      <a:srgbClr val="000000"/>
-                                    </a:solidFill>
-                                    <a:round/>
-                                    <a:headEnd/>
-                                    <a:tailEnd/>
-                                  </a14:hiddenLine>
-                                </a:ext>
-                              </a:extLst>
-                            </wps:spPr>
-                            <wps:bodyPr vert="horz" wrap="square" lIns="91440" tIns="45720" rIns="91440" bIns="45720" numCol="1" anchor="t" anchorCtr="0" compatLnSpc="1">
-                              <a:prstTxWarp prst="textNoShape">
-                                <a:avLst/>
-                              </a:prstTxWarp>
-                            </wps:bodyPr>
-                          </wps:wsp>
-                          <wps:wsp>
-                            <wps:cNvPr id="67" name="Freeform 67"/>
-                            <wps:cNvSpPr>
-                              <a:spLocks/>
-                            </wps:cNvSpPr>
-                            <wps:spPr bwMode="auto">
-                              <a:xfrm>
-                                <a:off x="1216025" y="498475"/>
-                                <a:ext cx="3113088" cy="3121025"/>
-                              </a:xfrm>
-                              <a:custGeom>
-                                <a:avLst/>
-                                <a:gdLst>
-                                  <a:gd name="T0" fmla="*/ 9 w 1961"/>
-                                  <a:gd name="T1" fmla="*/ 1966 h 1966"/>
-                                  <a:gd name="T2" fmla="*/ 0 w 1961"/>
-                                  <a:gd name="T3" fmla="*/ 1957 h 1966"/>
-                                  <a:gd name="T4" fmla="*/ 1952 w 1961"/>
-                                  <a:gd name="T5" fmla="*/ 0 h 1966"/>
-                                  <a:gd name="T6" fmla="*/ 1961 w 1961"/>
-                                  <a:gd name="T7" fmla="*/ 9 h 1966"/>
-                                  <a:gd name="T8" fmla="*/ 9 w 1961"/>
-                                  <a:gd name="T9" fmla="*/ 1966 h 1966"/>
-                                </a:gdLst>
-                                <a:ahLst/>
-                                <a:cxnLst>
-                                  <a:cxn ang="0">
-                                    <a:pos x="T0" y="T1"/>
-                                  </a:cxn>
-                                  <a:cxn ang="0">
-                                    <a:pos x="T2" y="T3"/>
-                                  </a:cxn>
-                                  <a:cxn ang="0">
-                                    <a:pos x="T4" y="T5"/>
-                                  </a:cxn>
-                                  <a:cxn ang="0">
-                                    <a:pos x="T6" y="T7"/>
-                                  </a:cxn>
-                                  <a:cxn ang="0">
-                                    <a:pos x="T8" y="T9"/>
-                                  </a:cxn>
-                                </a:cxnLst>
-                                <a:rect l="0" t="0" r="r" b="b"/>
-                                <a:pathLst>
-                                  <a:path w="1961" h="1966">
-                                    <a:moveTo>
-                                      <a:pt x="9" y="1966"/>
-                                    </a:moveTo>
-                                    <a:lnTo>
-                                      <a:pt x="0" y="1957"/>
-                                    </a:lnTo>
-                                    <a:lnTo>
-                                      <a:pt x="1952" y="0"/>
-                                    </a:lnTo>
-                                    <a:lnTo>
-                                      <a:pt x="1961" y="9"/>
-                                    </a:lnTo>
-                                    <a:lnTo>
-                                      <a:pt x="9" y="1966"/>
-                                    </a:lnTo>
-                                    <a:close/>
-                                  </a:path>
-                                </a:pathLst>
-                              </a:custGeom>
-                              <a:grpFill/>
-                              <a:ln>
-                                <a:noFill/>
-                              </a:ln>
-                              <a:extLst>
-                                <a:ext uri="{91240B29-F687-4F45-9708-019B960494DF}">
-                                  <a14:hiddenLine xmlns:a14="http://schemas.microsoft.com/office/drawing/2010/main" w="9525">
-                                    <a:solidFill>
-                                      <a:srgbClr val="000000"/>
-                                    </a:solidFill>
-                                    <a:round/>
-                                    <a:headEnd/>
-                                    <a:tailEnd/>
-                                  </a14:hiddenLine>
-                                </a:ext>
-                              </a:extLst>
-                            </wps:spPr>
-                            <wps:bodyPr vert="horz" wrap="square" lIns="91440" tIns="45720" rIns="91440" bIns="45720" numCol="1" anchor="t" anchorCtr="0" compatLnSpc="1">
-                              <a:prstTxWarp prst="textNoShape">
-                                <a:avLst/>
-                              </a:prstTxWarp>
-                            </wps:bodyPr>
-                          </wps:wsp>
-                          <wps:wsp>
-                            <wps:cNvPr id="68" name="Freeform 68"/>
-                            <wps:cNvSpPr>
-                              <a:spLocks/>
-                            </wps:cNvSpPr>
-                            <wps:spPr bwMode="auto">
-                              <a:xfrm>
-                                <a:off x="0" y="153988"/>
-                                <a:ext cx="4329113" cy="4337050"/>
-                              </a:xfrm>
-                              <a:custGeom>
-                                <a:avLst/>
-                                <a:gdLst>
-                                  <a:gd name="T0" fmla="*/ 0 w 2727"/>
-                                  <a:gd name="T1" fmla="*/ 2732 h 2732"/>
-                                  <a:gd name="T2" fmla="*/ 0 w 2727"/>
-                                  <a:gd name="T3" fmla="*/ 2728 h 2732"/>
-                                  <a:gd name="T4" fmla="*/ 2722 w 2727"/>
-                                  <a:gd name="T5" fmla="*/ 0 h 2732"/>
-                                  <a:gd name="T6" fmla="*/ 2727 w 2727"/>
-                                  <a:gd name="T7" fmla="*/ 5 h 2732"/>
-                                  <a:gd name="T8" fmla="*/ 0 w 2727"/>
-                                  <a:gd name="T9" fmla="*/ 2732 h 2732"/>
-                                </a:gdLst>
-                                <a:ahLst/>
-                                <a:cxnLst>
-                                  <a:cxn ang="0">
-                                    <a:pos x="T0" y="T1"/>
-                                  </a:cxn>
-                                  <a:cxn ang="0">
-                                    <a:pos x="T2" y="T3"/>
-                                  </a:cxn>
-                                  <a:cxn ang="0">
-                                    <a:pos x="T4" y="T5"/>
-                                  </a:cxn>
-                                  <a:cxn ang="0">
-                                    <a:pos x="T6" y="T7"/>
-                                  </a:cxn>
-                                  <a:cxn ang="0">
-                                    <a:pos x="T8" y="T9"/>
-                                  </a:cxn>
-                                </a:cxnLst>
-                                <a:rect l="0" t="0" r="r" b="b"/>
-                                <a:pathLst>
-                                  <a:path w="2727" h="2732">
-                                    <a:moveTo>
-                                      <a:pt x="0" y="2732"/>
-                                    </a:moveTo>
-                                    <a:lnTo>
-                                      <a:pt x="0" y="2728"/>
-                                    </a:lnTo>
-                                    <a:lnTo>
-                                      <a:pt x="2722" y="0"/>
-                                    </a:lnTo>
-                                    <a:lnTo>
-                                      <a:pt x="2727" y="5"/>
-                                    </a:lnTo>
-                                    <a:lnTo>
-                                      <a:pt x="0" y="2732"/>
-                                    </a:lnTo>
-                                    <a:close/>
-                                  </a:path>
-                                </a:pathLst>
-                              </a:custGeom>
-                              <a:grpFill/>
-                              <a:ln>
-                                <a:noFill/>
-                              </a:ln>
-                              <a:extLst>
-                                <a:ext uri="{91240B29-F687-4F45-9708-019B960494DF}">
-                                  <a14:hiddenLine xmlns:a14="http://schemas.microsoft.com/office/drawing/2010/main" w="9525">
-                                    <a:solidFill>
-                                      <a:srgbClr val="000000"/>
-                                    </a:solidFill>
-                                    <a:round/>
-                                    <a:headEnd/>
-                                    <a:tailEnd/>
-                                  </a14:hiddenLine>
-                                </a:ext>
-                              </a:extLst>
-                            </wps:spPr>
-                            <wps:bodyPr vert="horz" wrap="square" lIns="91440" tIns="45720" rIns="91440" bIns="45720" numCol="1" anchor="t" anchorCtr="0" compatLnSpc="1">
-                              <a:prstTxWarp prst="textNoShape">
-                                <a:avLst/>
-                              </a:prstTxWarp>
-                            </wps:bodyPr>
-                          </wps:wsp>
-                        </wpg:wgp>
-                      </a:graphicData>
-                    </a:graphic>
-                    <wp14:sizeRelH relativeFrom="page">
-                      <wp14:pctWidth>70600</wp14:pctWidth>
-                    </wp14:sizeRelH>
-                    <wp14:sizeRelV relativeFrom="page">
-                      <wp14:pctHeight>56600</wp14:pctHeight>
-                    </wp14:sizeRelV>
-                  </wp:anchor>
-                </w:drawing>
-              </mc:Choice>
-              <mc:Fallback>
-                <w:pict>
-                  <v:group w14:anchorId="6A2B635E" id="Group 2" o:spid="_x0000_s1026" style="position:absolute;margin-left:0;margin-top:0;width:432.65pt;height:448.55pt;z-index:-251656192;mso-width-percent:706;mso-height-percent:566;mso-left-percent:220;mso-top-percent:300;mso-position-horizontal-relative:page;mso-position-vertical-relative:page;mso-width-percent:706;mso-height-percent:566;mso-left-percent:220;mso-top-percent:300" coordsize="43291,44910" o:gfxdata="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">
-                    <o:lock v:ext="edit" aspectratio="t"/>
-                    <v:shape id="Freeform 64" o:spid="_x0000_s1027" style="position:absolute;left:15017;width:28274;height:28352;visibility:visible;mso-wrap-style:square;v-text-anchor:top" coordsize="1781,1786" o:gfxdata="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" path="m4,1786l,1782,1776,r5,5l4,1786xe" filled="f" stroked="f">
-                      <v:path arrowok="t" o:connecttype="custom" o:connectlocs="6350,2835275;0,2828925;2819400,0;2827338,7938;6350,2835275" o:connectangles="0,0,0,0,0"/>
-                    </v:shape>
-                    <v:shape id="Freeform 65" o:spid="_x0000_s1028" style="position:absolute;left:7826;top:2270;width:35465;height:35464;visibility:visible;mso-wrap-style:square;v-text-anchor:top" coordsize="2234,2234" o:gfxdata="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" path="m5,2234l,2229,2229,r5,5l5,2234xe" filled="f" stroked="f">
-                      <v:path arrowok="t" o:connecttype="custom" o:connectlocs="7938,3546475;0,3538538;3538538,0;3546475,7938;7938,3546475" o:connectangles="0,0,0,0,0"/>
-                    </v:shape>
-                    <v:shape id="Freeform 66" o:spid="_x0000_s1029" style="position:absolute;left:8413;top:1095;width:34878;height:34877;visibility:visible;mso-wrap-style:square;v-text-anchor:top" coordsize="2197,2197" o:gfxdata="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" path="m9,2197l,2193,2188,r9,10l9,2197xe" filled="f" stroked="f">
-                      <v:path arrowok="t" o:connecttype="custom" o:connectlocs="14288,3487738;0,3481388;3473450,0;3487738,15875;14288,3487738" o:connectangles="0,0,0,0,0"/>
-                    </v:shape>
-                    <v:shape id="Freeform 67" o:spid="_x0000_s1030" style="position:absolute;left:12160;top:4984;width:31131;height:31211;visibility:visible;mso-wrap-style:square;v-text-anchor:top" coordsize="1961,1966" o:gfxdata="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" path="m9,1966l,1957,1952,r9,9l9,1966xe" filled="f" stroked="f">
-                      <v:path arrowok="t" o:connecttype="custom" o:connectlocs="14288,3121025;0,3106738;3098800,0;3113088,14288;14288,3121025" o:connectangles="0,0,0,0,0"/>
-                    </v:shape>
-                    <v:shape id="Freeform 68" o:spid="_x0000_s1031" style="position:absolute;top:1539;width:43291;height:43371;visibility:visible;mso-wrap-style:square;v-text-anchor:top" coordsize="2727,2732" o:gfxdata="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" path="m,2732r,-4l2722,r5,5l,2732xe" filled="f" stroked="f">
-                      <v:path arrowok="t" o:connecttype="custom" o:connectlocs="0,4337050;0,4330700;4321175,0;4329113,7938;0,4337050" o:connectangles="0,0,0,0,0"/>
-                    </v:shape>
-                    <w10:wrap anchorx="page" anchory="page"/>
-                  </v:group>
-                </w:pict>
-              </mc:Fallback>
-            </mc:AlternateContent>
-          </w:r>
-          <w:r>
-            <w:rPr>
-              <w:noProof/>
-            </w:rPr>
-            <mc:AlternateContent>
-              <mc:Choice Requires="wps">
-                <w:drawing>
-                  <wp:anchor distT="0" distB="0" distL="114300" distR="114300" simplePos="0" relativeHeight="251659264" behindDoc="0" locked="0" layoutInCell="1" allowOverlap="1" wp14:anchorId="05EE9DF1" wp14:editId="2E2DCAF8">
-                    <wp:simplePos x="0" y="0"/>
-                    <wp:positionH relativeFrom="page">
-                      <wp:align>center</wp:align>
-                    </wp:positionH>
-                    <wp:positionV relativeFrom="margin">
-                      <wp:align>bottom</wp:align>
-                    </wp:positionV>
-                    <wp:extent cx="5943600" cy="374904"/>
-                    <wp:effectExtent l="0" t="0" r="0" b="2540"/>
-                    <wp:wrapNone/>
-                    <wp:docPr id="69" name="Text Box 73"/>
-                    <wp:cNvGraphicFramePr/>
-                    <a:graphic xmlns:a="http://schemas.openxmlformats.org/drawingml/2006/main">
-                      <a:graphicData uri="http://schemas.microsoft.com/office/word/2010/wordprocessingShape">
-                        <wps:wsp>
-                          <wps:cNvSpPr txBox="1"/>
-                          <wps:spPr>
-                            <a:xfrm>
-                              <a:off x="0" y="0"/>
-                              <a:ext cx="5943600" cy="374904"/>
-                            </a:xfrm>
-                            <a:prstGeom prst="rect">
-                              <a:avLst/>
-                            </a:prstGeom>
-                            <a:noFill/>
-                            <a:ln w="6350">
-                              <a:noFill/>
-                            </a:ln>
-                            <a:effectLst/>
-                          </wps:spPr>
-                          <wps:style>
-                            <a:lnRef idx="0">
-                              <a:schemeClr val="accent1"/>
-                            </a:lnRef>
-                            <a:fillRef idx="0">
-                              <a:schemeClr val="accent1"/>
-                            </a:fillRef>
-                            <a:effectRef idx="0">
-                              <a:schemeClr val="accent1"/>
-                            </a:effectRef>
-                            <a:fontRef idx="minor">
-                              <a:schemeClr val="dk1"/>
-                            </a:fontRef>
-                          </wps:style>
-                          <wps:txbx>
-                            <w:txbxContent>
-                              <w:p>
-                                <w:pPr>
-                                  <w:pStyle w:val="NoSpacing"/>
-                                  <w:jc w:val="right"/>
-                                  <w:rPr>
-                                    <w:color w:val="4472C4" w:themeColor="accent1"/>
-                                    <w:sz w:val="36"/>
-                                    <w:szCs w:val="36"/>
-                                  </w:rPr>
-                                </w:pPr>
-                                <w:sdt>
-                                  <w:sdtPr>
-                                    <w:rPr>
-                                      <w:color w:val="4472C4" w:themeColor="accent1"/>
-                                      <w:sz w:val="36"/>
-                                      <w:szCs w:val="36"/>
-                                    </w:rPr>
-                                    <w:alias w:val="School"/>
-                                    <w:tag w:val="School"/>
-                                    <w:id w:val="1850680582"/>
-                                    <w:dataBinding w:prefixMappings="xmlns:ns0='http://schemas.openxmlformats.org/officeDocument/2006/extended-properties' " w:xpath="/ns0:Properties[1]/ns0:Company[1]" w:storeItemID="{6668398D-A668-4E3E-A5EB-62B293D839F1}"/>
-                                    <w:text/>
-                                  </w:sdtPr>
-                                  <w:sdtContent>
-                                    <w:r>
-                                      <w:rPr>
-                                        <w:color w:val="4472C4" w:themeColor="accent1"/>
-                                        <w:sz w:val="36"/>
-                                        <w:szCs w:val="36"/>
-                                      </w:rPr>
-                                      <w:t>Matthew Fish Student ID: 10855826</w:t>
-                                    </w:r>
-                                  </w:sdtContent>
-                                </w:sdt>
-                              </w:p>
-                              <w:sdt>
-                                <w:sdtPr>
-                                  <w:rPr>
-                                    <w:color w:val="4472C4" w:themeColor="accent1"/>
-                                    <w:sz w:val="36"/>
-                                    <w:szCs w:val="36"/>
-                                  </w:rPr>
-                                  <w:alias w:val="Course"/>
-                                  <w:tag w:val="Course"/>
-                                  <w:id w:val="1717703537"/>
-                                  <w:dataBinding w:prefixMappings="xmlns:ns0='http://purl.org/dc/elements/1.1/' xmlns:ns1='http://schemas.openxmlformats.org/package/2006/metadata/core-properties' " w:xpath="/ns1:coreProperties[1]/ns1:category[1]" w:storeItemID="{6C3C8BC8-F283-45AE-878A-BAB7291924A1}"/>
-                                  <w:text/>
-                                </w:sdtPr>
-                                <w:sdtContent>
-                                  <w:p>
-                                    <w:pPr>
-                                      <w:pStyle w:val="NoSpacing"/>
-                                      <w:jc w:val="right"/>
-                                      <w:rPr>
-                                        <w:color w:val="4472C4" w:themeColor="accent1"/>
-                                        <w:sz w:val="36"/>
-                                        <w:szCs w:val="36"/>
-                                      </w:rPr>
-                                    </w:pPr>
-                                    <w:r>
-                                      <w:rPr>
-                                        <w:color w:val="4472C4" w:themeColor="accent1"/>
-                                        <w:sz w:val="36"/>
-                                        <w:szCs w:val="36"/>
-                                      </w:rPr>
-                                      <w:t>Supervisor: Nathan Clarke</w:t>
-                                    </w:r>
-                                  </w:p>
-                                </w:sdtContent>
-                              </w:sdt>
-                            </w:txbxContent>
-                          </wps:txbx>
-                          <wps:bodyPr rot="0" spcFirstLastPara="0" vertOverflow="overflow" horzOverflow="overflow" vert="horz" wrap="square" lIns="0" tIns="0" rIns="0" bIns="0" numCol="1" spcCol="0" rtlCol="0" fromWordArt="0" anchor="b" anchorCtr="0" forceAA="0" compatLnSpc="1">
-                            <a:prstTxWarp prst="textNoShape">
-                              <a:avLst/>
-                            </a:prstTxWarp>
-                            <a:spAutoFit/>
-                          </wps:bodyPr>
-                        </wps:wsp>
-                      </a:graphicData>
-                    </a:graphic>
-                    <wp14:sizeRelH relativeFrom="page">
-                      <wp14:pctWidth>76500</wp14:pctWidth>
-                    </wp14:sizeRelH>
-                    <wp14:sizeRelV relativeFrom="margin">
-                      <wp14:pctHeight>0</wp14:pctHeight>
-                    </wp14:sizeRelV>
-                  </wp:anchor>
-                </w:drawing>
-              </mc:Choice>
-              <mc:Fallback>
-                <w:pict>
-                  <v:shape w14:anchorId="05EE9DF1" id="Text Box 73" o:spid="_x0000_s1027" type="#_x0000_t202" style="position:absolute;margin-left:0;margin-top:0;width:468pt;height:29.5pt;z-index:251659264;visibility:visible;mso-wrap-style:square;mso-width-percent:765;mso-height-percent:0;mso-wrap-distance-left:9pt;mso-wrap-distance-top:0;mso-wrap-distance-right:9pt;mso-wrap-distance-bottom:0;mso-position-horizontal:center;mso-position-horizontal-relative:page;mso-position-vertical:bottom;mso-position-vertical-relative:margin;mso-width-percent:765;mso-height-percent:0;mso-width-relative:page;mso-height-relative:margin;v-text-anchor:bottom" o:gfxdata="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" filled="f" stroked="f" strokeweight=".5pt">
-                    <v:textbox style="mso-fit-shape-to-text:t" inset="0,0,0,0">
-                      <w:txbxContent>
-                        <w:p>
-                          <w:pPr>
-                            <w:pStyle w:val="NoSpacing"/>
-                            <w:jc w:val="right"/>
-                            <w:rPr>
-                              <w:color w:val="4472C4" w:themeColor="accent1"/>
-                              <w:sz w:val="36"/>
-                              <w:szCs w:val="36"/>
-                            </w:rPr>
-                          </w:pPr>
-                          <w:sdt>
-                            <w:sdtPr>
-                              <w:rPr>
-                                <w:color w:val="4472C4" w:themeColor="accent1"/>
-                                <w:sz w:val="36"/>
-                                <w:szCs w:val="36"/>
-                              </w:rPr>
-                              <w:alias w:val="School"/>
-                              <w:tag w:val="School"/>
-                              <w:id w:val="1850680582"/>
-                              <w:dataBinding w:prefixMappings="xmlns:ns0='http://schemas.openxmlformats.org/officeDocument/2006/extended-properties' " w:xpath="/ns0:Properties[1]/ns0:Company[1]" w:storeItemID="{6668398D-A668-4E3E-A5EB-62B293D839F1}"/>
-                              <w:text/>
-                            </w:sdtPr>
-                            <w:sdtContent>
-                              <w:r>
-                                <w:rPr>
-                                  <w:color w:val="4472C4" w:themeColor="accent1"/>
-                                  <w:sz w:val="36"/>
-                                  <w:szCs w:val="36"/>
-                                </w:rPr>
-                                <w:t>Matthew Fish Student ID: 10855826</w:t>
-                              </w:r>
-                            </w:sdtContent>
-                          </w:sdt>
-                        </w:p>
-                        <w:sdt>
-                          <w:sdtPr>
-                            <w:rPr>
-                              <w:color w:val="4472C4" w:themeColor="accent1"/>
-                              <w:sz w:val="36"/>
-                              <w:szCs w:val="36"/>
-                            </w:rPr>
-                            <w:alias w:val="Course"/>
-                            <w:tag w:val="Course"/>
-                            <w:id w:val="1717703537"/>
-                            <w:dataBinding w:prefixMappings="xmlns:ns0='http://purl.org/dc/elements/1.1/' xmlns:ns1='http://schemas.openxmlformats.org/package/2006/metadata/core-properties' " w:xpath="/ns1:coreProperties[1]/ns1:category[1]" w:storeItemID="{6C3C8BC8-F283-45AE-878A-BAB7291924A1}"/>
-                            <w:text/>
-                          </w:sdtPr>
-                          <w:sdtContent>
-                            <w:p>
-                              <w:pPr>
-                                <w:pStyle w:val="NoSpacing"/>
-                                <w:jc w:val="right"/>
-                                <w:rPr>
-                                  <w:color w:val="4472C4" w:themeColor="accent1"/>
-                                  <w:sz w:val="36"/>
-                                  <w:szCs w:val="36"/>
-                                </w:rPr>
-                              </w:pPr>
-                              <w:r>
-                                <w:rPr>
-                                  <w:color w:val="4472C4" w:themeColor="accent1"/>
-                                  <w:sz w:val="36"/>
-                                  <w:szCs w:val="36"/>
-                                </w:rPr>
-                                <w:t>Supervisor: Nathan Clarke</w:t>
-                              </w:r>
-                            </w:p>
-                          </w:sdtContent>
-                        </w:sdt>
-                      </w:txbxContent>
-                    </v:textbox>
-                    <w10:wrap anchorx="page" anchory="margin"/>
-                  </v:shape>
-                </w:pict>
-              </mc:Fallback>
-            </mc:AlternateContent>
+            <w:t xml:space="preserve">School of engineering, </w:t>
           </w:r>
         </w:p>
         <w:p>
           <w:pPr>
+            <w:pStyle w:val="Title"/>
+            <w:jc w:val="center"/>
+            <w:rPr>
+              <w:sz w:val="52"/>
+              <w:szCs w:val="52"/>
+            </w:rPr>
+          </w:pPr>
+          <w:r>
+            <w:rPr>
+              <w:sz w:val="52"/>
+              <w:szCs w:val="52"/>
+            </w:rPr>
+            <w:t>computing, and mathematics</w:t>
+          </w:r>
+        </w:p>
+        <w:p/>
+        <w:p/>
+        <w:p>
+          <w:pPr>
+            <w:rPr>
+              <w:sz w:val="20"/>
+              <w:szCs w:val="20"/>
+            </w:rPr>
+          </w:pPr>
+        </w:p>
+        <w:p>
+          <w:pPr>
+            <w:pStyle w:val="Title"/>
+            <w:jc w:val="center"/>
+            <w:rPr>
+              <w:sz w:val="52"/>
+              <w:szCs w:val="52"/>
+            </w:rPr>
+          </w:pPr>
+          <w:r>
+            <w:rPr>
+              <w:sz w:val="52"/>
+              <w:szCs w:val="52"/>
+            </w:rPr>
+            <w:t>Final Stage Computing Project</w:t>
+          </w:r>
+        </w:p>
+        <w:p>
+          <w:pPr>
+            <w:pStyle w:val="Title"/>
+            <w:jc w:val="center"/>
+            <w:rPr>
+              <w:sz w:val="52"/>
+              <w:szCs w:val="52"/>
+            </w:rPr>
+          </w:pPr>
+          <w:r>
+            <w:rPr>
+              <w:sz w:val="52"/>
+              <w:szCs w:val="52"/>
+            </w:rPr>
+            <w:t>2025/2026</w:t>
+          </w:r>
+        </w:p>
+        <w:p/>
+        <w:p/>
+        <w:p>
+          <w:pPr>
+            <w:jc w:val="center"/>
+          </w:pPr>
+        </w:p>
+        <w:p>
+          <w:pPr>
+            <w:pStyle w:val="Title"/>
+            <w:jc w:val="center"/>
             <w:rPr>
               <w:b/>
               <w:bCs/>
@@ -1047,55 +155,186 @@
               <w:b/>
               <w:bCs/>
             </w:rPr>
-            <w:br w:type="page"/>
+            <w:t>S.I.R.A: Simplifying Cybersecurity</w:t>
+          </w:r>
+        </w:p>
+        <w:p>
+          <w:pPr>
+            <w:pStyle w:val="Title"/>
+            <w:jc w:val="center"/>
+            <w:rPr>
+              <w:b/>
+              <w:bCs/>
+            </w:rPr>
+          </w:pPr>
+          <w:r>
+            <w:rPr>
+              <w:b/>
+              <w:bCs/>
+            </w:rPr>
+            <w:t>for SMEs</w:t>
+          </w:r>
+        </w:p>
+        <w:p/>
+        <w:p/>
+        <w:p/>
+        <w:p>
+          <w:pPr>
+            <w:jc w:val="center"/>
+            <w:rPr>
+              <w:sz w:val="32"/>
+              <w:szCs w:val="32"/>
+            </w:rPr>
+          </w:pPr>
+          <w:r>
+            <w:rPr>
+              <w:sz w:val="32"/>
+              <w:szCs w:val="32"/>
+            </w:rPr>
+            <w:t>Matthew Fish</w:t>
+          </w:r>
+        </w:p>
+        <w:p>
+          <w:pPr>
+            <w:jc w:val="center"/>
+            <w:rPr>
+              <w:sz w:val="32"/>
+              <w:szCs w:val="32"/>
+            </w:rPr>
+          </w:pPr>
+          <w:r>
+            <w:rPr>
+              <w:sz w:val="32"/>
+              <w:szCs w:val="32"/>
+            </w:rPr>
+            <w:t>10855826</w:t>
+          </w:r>
+        </w:p>
+        <w:p>
+          <w:pPr>
+            <w:jc w:val="center"/>
+            <w:rPr>
+              <w:sz w:val="32"/>
+              <w:szCs w:val="32"/>
+            </w:rPr>
+          </w:pPr>
+          <w:r>
+            <w:rPr>
+              <w:sz w:val="32"/>
+              <w:szCs w:val="32"/>
+            </w:rPr>
+            <w:t>BSc (Hons) Computer Science (Cyber Security)</w:t>
+          </w:r>
+        </w:p>
+        <w:p/>
+        <w:p/>
+        <w:p/>
+        <w:p/>
+        <w:p/>
+        <w:p/>
+        <w:p>
+          <w:pPr>
+            <w:rPr>
+              <w:sz w:val="32"/>
+              <w:szCs w:val="32"/>
+            </w:rPr>
+          </w:pPr>
+          <w:bookmarkStart w:id="0" w:name="_Toc224738215"/>
+          <w:r>
+            <w:rPr>
+              <w:rStyle w:val="Heading1Char"/>
+              <w:sz w:val="32"/>
+              <w:szCs w:val="32"/>
+            </w:rPr>
+            <w:lastRenderedPageBreak/>
+            <w:t>Acknowledgements</w:t>
+          </w:r>
+          <w:bookmarkEnd w:id="0"/>
+          <w:r>
+            <w:rPr>
+              <w:sz w:val="32"/>
+              <w:szCs w:val="32"/>
+            </w:rPr>
+            <w:t xml:space="preserve"> </w:t>
+          </w:r>
+        </w:p>
+        <w:p>
+          <w:r>
+            <w:t>I would like to express my gratitude to my supervisor, Nathan Clarke, for his continuous guidance and support throughout this project. His constant availability and willingness to help whenever in need ultimately led to a stronger end product. I would also like to extend my thanks to my family and friends who have supported and encouraged me along the way.</w:t>
           </w:r>
         </w:p>
         <w:p>
           <w:pPr>
             <w:pStyle w:val="Heading1"/>
+            <w:rPr>
+              <w:sz w:val="32"/>
+              <w:szCs w:val="32"/>
+            </w:rPr>
           </w:pPr>
-          <w:bookmarkStart w:id="0" w:name="_Toc224646147"/>
+          <w:bookmarkStart w:id="1" w:name="_Toc224738216"/>
           <w:r>
-            <w:lastRenderedPageBreak/>
-            <w:t xml:space="preserve">Abstract </w:t>
+            <w:rPr>
+              <w:sz w:val="32"/>
+              <w:szCs w:val="32"/>
+            </w:rPr>
+            <w:t>Abstract</w:t>
+          </w:r>
+          <w:bookmarkEnd w:id="1"/>
+          <w:r>
+            <w:rPr>
+              <w:sz w:val="32"/>
+              <w:szCs w:val="32"/>
+            </w:rPr>
+            <w:t xml:space="preserve"> </w:t>
+          </w:r>
+        </w:p>
+        <w:p>
+          <w:r>
+            <w:t>Small and medium-sized enterprises (SMEs) face a growing volume of targeted cyberattacks, with recent reports indicating that 59% experience breaches annually</w:t>
+          </w:r>
+          <w:r>
+            <w:t xml:space="preserve"> </w:t>
+          </w:r>
+          <w:r>
+            <w:rPr>
+              <w:b/>
+              <w:bCs/>
+            </w:rPr>
+            <w:t>[1]</w:t>
+          </w:r>
+          <w:r>
+            <w:t>. Despite this, SMEs frequently lack the capital for dedicated Security Operations Centres (SOCs) or enterprise-grade SIEMs. While many implement open-source intrusion detection systems like Snort, they struggle to interpret the complex, raw technical logs generated. This report details the development of S.I.R.A. (Security Incident Response Assistant), an affordable, LLM-powered incident response dashboard designed to bridge this expertise gap.</w:t>
+          </w:r>
+        </w:p>
+        <w:p>
+          <w:r>
+            <w:t xml:space="preserve">The report explores the system's architecture, which integrates a Python-based log watcher with Google’s Gemini 1.5 Flash API and </w:t>
+          </w:r>
+          <w:proofErr w:type="spellStart"/>
+          <w:r>
+            <w:t>Firestore</w:t>
+          </w:r>
+          <w:proofErr w:type="spellEnd"/>
+          <w:r>
+            <w:t xml:space="preserve"> for real-time data synchronisation. To guarantee data privacy, the implementation features a strict two-tier security pipeline: raw logs undergo local regex sanitisation to strip Personally Identifiable Information (PII) prior to LLM analysis, ensuring no sensitive data is processed by the AI. Subsequently, all incident records and AI summaries are secured via Fernet AES encryption before being transmitted to the cloud database. A React-based frontend then decrypts and translates this data into an intuitive dashboard, leveraging dynamic AI personas to tailor the technical depth of mitigation playbooks for Business Owners, Junior IT staff, or SOC Analysts.</w:t>
+          </w:r>
+        </w:p>
+        <w:p>
+          <w:r>
+            <w:t>Following the software development lifecycle, the report justifies the technology stack, details the system design, and highlights key engineering challenges overcome during implementation. Finally, the application is rigorously evaluated through security assessments and User Acceptance Testing (UAT). The report concludes with a critical project post-mortem, proving that S.I.R.A. successfully simplifies incident management while proposing future enhancements such as JWT authentication and automated firewall integration.</w:t>
           </w:r>
         </w:p>
       </w:sdtContent>
     </w:sdt>
-    <w:bookmarkEnd w:id="0" w:displacedByCustomXml="prev"/>
-    <w:p>
-      <w:r>
-        <w:t xml:space="preserve">A 250-word summary of the problem, your solution, and </w:t>
-      </w:r>
-      <w:proofErr w:type="gramStart"/>
-      <w:r>
-        <w:t>the final result</w:t>
-      </w:r>
-      <w:proofErr w:type="gramEnd"/>
-      <w:r>
-        <w:t xml:space="preserve"> (You can use the Project Description we wrote earlier for this!).</w:t>
-      </w:r>
-    </w:p>
-    <w:p>
-      <w:bookmarkStart w:id="1" w:name="_Toc224646148"/>
-      <w:r>
-        <w:rPr>
-          <w:rStyle w:val="Heading1Char"/>
-        </w:rPr>
-        <w:t>Acknowledgements</w:t>
-      </w:r>
-      <w:bookmarkEnd w:id="1"/>
-      <w:r>
-        <w:t xml:space="preserve"> </w:t>
-      </w:r>
-    </w:p>
-    <w:p>
-      <w:r>
-        <w:t>Thank your supervisor, participants in your user testing, etc.</w:t>
-      </w:r>
-    </w:p>
     <w:sdt>
       <w:sdtPr>
+        <w:rPr>
+          <w:rFonts w:asciiTheme="minorHAnsi" w:eastAsiaTheme="minorHAnsi" w:hAnsiTheme="minorHAnsi" w:cstheme="minorBidi"/>
+          <w:color w:val="auto"/>
+          <w:sz w:val="22"/>
+          <w:szCs w:val="22"/>
+          <w:lang w:val="en-GB"/>
+        </w:rPr>
         <w:id w:val="1803574860"/>
         <w:docPartObj>
           <w:docPartGallery w:val="Table of Contents"/>
@@ -1104,14 +343,9 @@
       </w:sdtPr>
       <w:sdtEndPr>
         <w:rPr>
-          <w:rFonts w:asciiTheme="minorHAnsi" w:eastAsiaTheme="minorHAnsi" w:hAnsiTheme="minorHAnsi" w:cstheme="minorBidi"/>
           <w:b/>
           <w:bCs/>
           <w:noProof/>
-          <w:color w:val="auto"/>
-          <w:sz w:val="22"/>
-          <w:szCs w:val="22"/>
-          <w:lang w:val="en-GB"/>
         </w:rPr>
       </w:sdtEndPr>
       <w:sdtContent>
@@ -1148,13 +382,13 @@
           <w:r>
             <w:fldChar w:fldCharType="separate"/>
           </w:r>
-          <w:hyperlink w:anchor="_Toc224646147" w:history="1">
+          <w:hyperlink w:anchor="_Toc224738215" w:history="1">
             <w:r>
               <w:rPr>
                 <w:rStyle w:val="Hyperlink"/>
                 <w:noProof/>
               </w:rPr>
-              <w:t xml:space="preserve">Abstract </w:t>
+              <w:t>Acknowledgements</w:t>
             </w:r>
             <w:r>
               <w:rPr>
@@ -1175,7 +409,7 @@
                 <w:noProof/>
                 <w:webHidden/>
               </w:rPr>
-              <w:instrText xml:space="preserve"> PAGEREF _Toc224646147 \h </w:instrText>
+              <w:instrText xml:space="preserve"> PAGEREF _Toc224738215 \h </w:instrText>
             </w:r>
             <w:r>
               <w:rPr>
@@ -1222,13 +456,13 @@
               <w14:ligatures w14:val="standardContextual"/>
             </w:rPr>
           </w:pPr>
-          <w:hyperlink w:anchor="_Toc224646148" w:history="1">
+          <w:hyperlink w:anchor="_Toc224738216" w:history="1">
             <w:r>
               <w:rPr>
                 <w:rStyle w:val="Hyperlink"/>
                 <w:noProof/>
               </w:rPr>
-              <w:t>Acknowledgements</w:t>
+              <w:t>Abstract</w:t>
             </w:r>
             <w:r>
               <w:rPr>
@@ -1249,7 +483,7 @@
                 <w:noProof/>
                 <w:webHidden/>
               </w:rPr>
-              <w:instrText xml:space="preserve"> PAGEREF _Toc224646148 \h </w:instrText>
+              <w:instrText xml:space="preserve"> PAGEREF _Toc224738216 \h </w:instrText>
             </w:r>
             <w:r>
               <w:rPr>
@@ -1296,13 +530,13 @@
               <w14:ligatures w14:val="standardContextual"/>
             </w:rPr>
           </w:pPr>
-          <w:hyperlink w:anchor="_Toc224646149" w:history="1">
+          <w:hyperlink w:anchor="_Toc224738217" w:history="1">
             <w:r>
               <w:rPr>
                 <w:rStyle w:val="Hyperlink"/>
                 <w:noProof/>
               </w:rPr>
-              <w:t>Chapter 1: Introduction (~1,000 words)</w:t>
+              <w:t>Word Count</w:t>
             </w:r>
             <w:r>
               <w:rPr>
@@ -1323,7 +557,7 @@
                 <w:noProof/>
                 <w:webHidden/>
               </w:rPr>
-              <w:instrText xml:space="preserve"> PAGEREF _Toc224646149 \h </w:instrText>
+              <w:instrText xml:space="preserve"> PAGEREF _Toc224738217 \h </w:instrText>
             </w:r>
             <w:r>
               <w:rPr>
@@ -1343,7 +577,155 @@
                 <w:noProof/>
                 <w:webHidden/>
               </w:rPr>
-              <w:t>2</w:t>
+              <w:t>3</w:t>
+            </w:r>
+            <w:r>
+              <w:rPr>
+                <w:noProof/>
+                <w:webHidden/>
+              </w:rPr>
+              <w:fldChar w:fldCharType="end"/>
+            </w:r>
+          </w:hyperlink>
+        </w:p>
+        <w:p>
+          <w:pPr>
+            <w:pStyle w:val="TOC1"/>
+            <w:tabs>
+              <w:tab w:val="right" w:leader="dot" w:pos="9016"/>
+            </w:tabs>
+            <w:rPr>
+              <w:rFonts w:eastAsiaTheme="minorEastAsia"/>
+              <w:noProof/>
+              <w:kern w:val="2"/>
+              <w:sz w:val="24"/>
+              <w:szCs w:val="24"/>
+              <w:lang w:eastAsia="en-GB"/>
+              <w14:ligatures w14:val="standardContextual"/>
+            </w:rPr>
+          </w:pPr>
+          <w:hyperlink w:anchor="_Toc224738218" w:history="1">
+            <w:r>
+              <w:rPr>
+                <w:rStyle w:val="Hyperlink"/>
+                <w:noProof/>
+              </w:rPr>
+              <w:t>Github Repo</w:t>
+            </w:r>
+            <w:r>
+              <w:rPr>
+                <w:noProof/>
+                <w:webHidden/>
+              </w:rPr>
+              <w:tab/>
+            </w:r>
+            <w:r>
+              <w:rPr>
+                <w:noProof/>
+                <w:webHidden/>
+              </w:rPr>
+              <w:fldChar w:fldCharType="begin"/>
+            </w:r>
+            <w:r>
+              <w:rPr>
+                <w:noProof/>
+                <w:webHidden/>
+              </w:rPr>
+              <w:instrText xml:space="preserve"> PAGEREF _Toc224738218 \h </w:instrText>
+            </w:r>
+            <w:r>
+              <w:rPr>
+                <w:noProof/>
+                <w:webHidden/>
+              </w:rPr>
+            </w:r>
+            <w:r>
+              <w:rPr>
+                <w:noProof/>
+                <w:webHidden/>
+              </w:rPr>
+              <w:fldChar w:fldCharType="separate"/>
+            </w:r>
+            <w:r>
+              <w:rPr>
+                <w:noProof/>
+                <w:webHidden/>
+              </w:rPr>
+              <w:t>3</w:t>
+            </w:r>
+            <w:r>
+              <w:rPr>
+                <w:noProof/>
+                <w:webHidden/>
+              </w:rPr>
+              <w:fldChar w:fldCharType="end"/>
+            </w:r>
+          </w:hyperlink>
+        </w:p>
+        <w:p>
+          <w:pPr>
+            <w:pStyle w:val="TOC1"/>
+            <w:tabs>
+              <w:tab w:val="right" w:leader="dot" w:pos="9016"/>
+            </w:tabs>
+            <w:rPr>
+              <w:rFonts w:eastAsiaTheme="minorEastAsia"/>
+              <w:noProof/>
+              <w:kern w:val="2"/>
+              <w:sz w:val="24"/>
+              <w:szCs w:val="24"/>
+              <w:lang w:eastAsia="en-GB"/>
+              <w14:ligatures w14:val="standardContextual"/>
+            </w:rPr>
+          </w:pPr>
+          <w:hyperlink w:anchor="_Toc224738219" w:history="1">
+            <w:r>
+              <w:rPr>
+                <w:rStyle w:val="Hyperlink"/>
+                <w:noProof/>
+              </w:rPr>
+              <w:t>1. Introduction (~1,000 words)</w:t>
+            </w:r>
+            <w:r>
+              <w:rPr>
+                <w:noProof/>
+                <w:webHidden/>
+              </w:rPr>
+              <w:tab/>
+            </w:r>
+            <w:r>
+              <w:rPr>
+                <w:noProof/>
+                <w:webHidden/>
+              </w:rPr>
+              <w:fldChar w:fldCharType="begin"/>
+            </w:r>
+            <w:r>
+              <w:rPr>
+                <w:noProof/>
+                <w:webHidden/>
+              </w:rPr>
+              <w:instrText xml:space="preserve"> PAGEREF _Toc224738219 \h </w:instrText>
+            </w:r>
+            <w:r>
+              <w:rPr>
+                <w:noProof/>
+                <w:webHidden/>
+              </w:rPr>
+            </w:r>
+            <w:r>
+              <w:rPr>
+                <w:noProof/>
+                <w:webHidden/>
+              </w:rPr>
+              <w:fldChar w:fldCharType="separate"/>
+            </w:r>
+            <w:r>
+              <w:rPr>
+                <w:noProof/>
+                <w:webHidden/>
+              </w:rPr>
+              <w:t>3</w:t>
             </w:r>
             <w:r>
               <w:rPr>
@@ -1370,7 +752,7 @@
               <w14:ligatures w14:val="standardContextual"/>
             </w:rPr>
           </w:pPr>
-          <w:hyperlink w:anchor="_Toc224646150" w:history="1">
+          <w:hyperlink w:anchor="_Toc224738220" w:history="1">
             <w:r>
               <w:rPr>
                 <w:rStyle w:val="Hyperlink"/>
@@ -1397,7 +779,7 @@
                 <w:noProof/>
                 <w:webHidden/>
               </w:rPr>
-              <w:instrText xml:space="preserve"> PAGEREF _Toc224646150 \h </w:instrText>
+              <w:instrText xml:space="preserve"> PAGEREF _Toc224738220 \h </w:instrText>
             </w:r>
             <w:r>
               <w:rPr>
@@ -1417,7 +799,7 @@
                 <w:noProof/>
                 <w:webHidden/>
               </w:rPr>
-              <w:t>2</w:t>
+              <w:t>3</w:t>
             </w:r>
             <w:r>
               <w:rPr>
@@ -1444,7 +826,7 @@
               <w14:ligatures w14:val="standardContextual"/>
             </w:rPr>
           </w:pPr>
-          <w:hyperlink w:anchor="_Toc224646151" w:history="1">
+          <w:hyperlink w:anchor="_Toc224738221" w:history="1">
             <w:r>
               <w:rPr>
                 <w:rStyle w:val="Hyperlink"/>
@@ -1471,7 +853,7 @@
                 <w:noProof/>
                 <w:webHidden/>
               </w:rPr>
-              <w:instrText xml:space="preserve"> PAGEREF _Toc224646151 \h </w:instrText>
+              <w:instrText xml:space="preserve"> PAGEREF _Toc224738221 \h </w:instrText>
             </w:r>
             <w:r>
               <w:rPr>
@@ -1491,7 +873,7 @@
                 <w:noProof/>
                 <w:webHidden/>
               </w:rPr>
-              <w:t>2</w:t>
+              <w:t>3</w:t>
             </w:r>
             <w:r>
               <w:rPr>
@@ -1518,7 +900,7 @@
               <w14:ligatures w14:val="standardContextual"/>
             </w:rPr>
           </w:pPr>
-          <w:hyperlink w:anchor="_Toc224646152" w:history="1">
+          <w:hyperlink w:anchor="_Toc224738222" w:history="1">
             <w:r>
               <w:rPr>
                 <w:rStyle w:val="Hyperlink"/>
@@ -1545,7 +927,7 @@
                 <w:noProof/>
                 <w:webHidden/>
               </w:rPr>
-              <w:instrText xml:space="preserve"> PAGEREF _Toc224646152 \h </w:instrText>
+              <w:instrText xml:space="preserve"> PAGEREF _Toc224738222 \h </w:instrText>
             </w:r>
             <w:r>
               <w:rPr>
@@ -1565,7 +947,7 @@
                 <w:noProof/>
                 <w:webHidden/>
               </w:rPr>
-              <w:t>2</w:t>
+              <w:t>3</w:t>
             </w:r>
             <w:r>
               <w:rPr>
@@ -1592,7 +974,7 @@
               <w14:ligatures w14:val="standardContextual"/>
             </w:rPr>
           </w:pPr>
-          <w:hyperlink w:anchor="_Toc224646153" w:history="1">
+          <w:hyperlink w:anchor="_Toc224738223" w:history="1">
             <w:r>
               <w:rPr>
                 <w:rStyle w:val="Hyperlink"/>
@@ -1619,7 +1001,7 @@
                 <w:noProof/>
                 <w:webHidden/>
               </w:rPr>
-              <w:instrText xml:space="preserve"> PAGEREF _Toc224646153 \h </w:instrText>
+              <w:instrText xml:space="preserve"> PAGEREF _Toc224738223 \h </w:instrText>
             </w:r>
             <w:r>
               <w:rPr>
@@ -1639,7 +1021,7 @@
                 <w:noProof/>
                 <w:webHidden/>
               </w:rPr>
-              <w:t>2</w:t>
+              <w:t>3</w:t>
             </w:r>
             <w:r>
               <w:rPr>
@@ -1666,13 +1048,13 @@
               <w14:ligatures w14:val="standardContextual"/>
             </w:rPr>
           </w:pPr>
-          <w:hyperlink w:anchor="_Toc224646154" w:history="1">
+          <w:hyperlink w:anchor="_Toc224738224" w:history="1">
             <w:r>
               <w:rPr>
                 <w:rStyle w:val="Hyperlink"/>
                 <w:noProof/>
               </w:rPr>
-              <w:t>Chapter 2: Literature Review &amp; Technologies (~2,000 words)</w:t>
+              <w:t>2. Literature Review &amp; Technologies (~2,000 words)</w:t>
             </w:r>
             <w:r>
               <w:rPr>
@@ -1693,7 +1075,7 @@
                 <w:noProof/>
                 <w:webHidden/>
               </w:rPr>
-              <w:instrText xml:space="preserve"> PAGEREF _Toc224646154 \h </w:instrText>
+              <w:instrText xml:space="preserve"> PAGEREF _Toc224738224 \h </w:instrText>
             </w:r>
             <w:r>
               <w:rPr>
@@ -1713,7 +1095,7 @@
                 <w:noProof/>
                 <w:webHidden/>
               </w:rPr>
-              <w:t>2</w:t>
+              <w:t>3</w:t>
             </w:r>
             <w:r>
               <w:rPr>
@@ -1740,7 +1122,7 @@
               <w14:ligatures w14:val="standardContextual"/>
             </w:rPr>
           </w:pPr>
-          <w:hyperlink w:anchor="_Toc224646155" w:history="1">
+          <w:hyperlink w:anchor="_Toc224738225" w:history="1">
             <w:r>
               <w:rPr>
                 <w:rStyle w:val="Hyperlink"/>
@@ -1767,7 +1149,7 @@
                 <w:noProof/>
                 <w:webHidden/>
               </w:rPr>
-              <w:instrText xml:space="preserve"> PAGEREF _Toc224646155 \h </w:instrText>
+              <w:instrText xml:space="preserve"> PAGEREF _Toc224738225 \h </w:instrText>
             </w:r>
             <w:r>
               <w:rPr>
@@ -1814,7 +1196,7 @@
               <w14:ligatures w14:val="standardContextual"/>
             </w:rPr>
           </w:pPr>
-          <w:hyperlink w:anchor="_Toc224646156" w:history="1">
+          <w:hyperlink w:anchor="_Toc224738226" w:history="1">
             <w:r>
               <w:rPr>
                 <w:rStyle w:val="Hyperlink"/>
@@ -1841,7 +1223,7 @@
                 <w:noProof/>
                 <w:webHidden/>
               </w:rPr>
-              <w:instrText xml:space="preserve"> PAGEREF _Toc224646156 \h </w:instrText>
+              <w:instrText xml:space="preserve"> PAGEREF _Toc224738226 \h </w:instrText>
             </w:r>
             <w:r>
               <w:rPr>
@@ -1888,7 +1270,7 @@
               <w14:ligatures w14:val="standardContextual"/>
             </w:rPr>
           </w:pPr>
-          <w:hyperlink w:anchor="_Toc224646157" w:history="1">
+          <w:hyperlink w:anchor="_Toc224738227" w:history="1">
             <w:r>
               <w:rPr>
                 <w:rStyle w:val="Hyperlink"/>
@@ -1915,7 +1297,7 @@
                 <w:noProof/>
                 <w:webHidden/>
               </w:rPr>
-              <w:instrText xml:space="preserve"> PAGEREF _Toc224646157 \h </w:instrText>
+              <w:instrText xml:space="preserve"> PAGEREF _Toc224738227 \h </w:instrText>
             </w:r>
             <w:r>
               <w:rPr>
@@ -1962,7 +1344,7 @@
               <w14:ligatures w14:val="standardContextual"/>
             </w:rPr>
           </w:pPr>
-          <w:hyperlink w:anchor="_Toc224646158" w:history="1">
+          <w:hyperlink w:anchor="_Toc224738228" w:history="1">
             <w:r>
               <w:rPr>
                 <w:rStyle w:val="Hyperlink"/>
@@ -1989,7 +1371,7 @@
                 <w:noProof/>
                 <w:webHidden/>
               </w:rPr>
-              <w:instrText xml:space="preserve"> PAGEREF _Toc224646158 \h </w:instrText>
+              <w:instrText xml:space="preserve"> PAGEREF _Toc224738228 \h </w:instrText>
             </w:r>
             <w:r>
               <w:rPr>
@@ -2036,13 +1418,13 @@
               <w14:ligatures w14:val="standardContextual"/>
             </w:rPr>
           </w:pPr>
-          <w:hyperlink w:anchor="_Toc224646159" w:history="1">
+          <w:hyperlink w:anchor="_Toc224738229" w:history="1">
             <w:r>
               <w:rPr>
                 <w:rStyle w:val="Hyperlink"/>
                 <w:noProof/>
               </w:rPr>
-              <w:t>Chapter 3: Requirements &amp; Specification (~1,000 words)</w:t>
+              <w:t>3. Requirements &amp; Specification (~1,000 words)</w:t>
             </w:r>
             <w:r>
               <w:rPr>
@@ -2063,7 +1445,7 @@
                 <w:noProof/>
                 <w:webHidden/>
               </w:rPr>
-              <w:instrText xml:space="preserve"> PAGEREF _Toc224646159 \h </w:instrText>
+              <w:instrText xml:space="preserve"> PAGEREF _Toc224738229 \h </w:instrText>
             </w:r>
             <w:r>
               <w:rPr>
@@ -2083,7 +1465,7 @@
                 <w:noProof/>
                 <w:webHidden/>
               </w:rPr>
-              <w:t>3</w:t>
+              <w:t>4</w:t>
             </w:r>
             <w:r>
               <w:rPr>
@@ -2110,7 +1492,7 @@
               <w14:ligatures w14:val="standardContextual"/>
             </w:rPr>
           </w:pPr>
-          <w:hyperlink w:anchor="_Toc224646160" w:history="1">
+          <w:hyperlink w:anchor="_Toc224738230" w:history="1">
             <w:r>
               <w:rPr>
                 <w:rStyle w:val="Hyperlink"/>
@@ -2137,7 +1519,7 @@
                 <w:noProof/>
                 <w:webHidden/>
               </w:rPr>
-              <w:instrText xml:space="preserve"> PAGEREF _Toc224646160 \h </w:instrText>
+              <w:instrText xml:space="preserve"> PAGEREF _Toc224738230 \h </w:instrText>
             </w:r>
             <w:r>
               <w:rPr>
@@ -2157,7 +1539,7 @@
                 <w:noProof/>
                 <w:webHidden/>
               </w:rPr>
-              <w:t>3</w:t>
+              <w:t>4</w:t>
             </w:r>
             <w:r>
               <w:rPr>
@@ -2184,7 +1566,7 @@
               <w14:ligatures w14:val="standardContextual"/>
             </w:rPr>
           </w:pPr>
-          <w:hyperlink w:anchor="_Toc224646161" w:history="1">
+          <w:hyperlink w:anchor="_Toc224738231" w:history="1">
             <w:r>
               <w:rPr>
                 <w:rStyle w:val="Hyperlink"/>
@@ -2211,7 +1593,7 @@
                 <w:noProof/>
                 <w:webHidden/>
               </w:rPr>
-              <w:instrText xml:space="preserve"> PAGEREF _Toc224646161 \h </w:instrText>
+              <w:instrText xml:space="preserve"> PAGEREF _Toc224738231 \h </w:instrText>
             </w:r>
             <w:r>
               <w:rPr>
@@ -2231,7 +1613,7 @@
                 <w:noProof/>
                 <w:webHidden/>
               </w:rPr>
-              <w:t>3</w:t>
+              <w:t>4</w:t>
             </w:r>
             <w:r>
               <w:rPr>
@@ -2258,7 +1640,7 @@
               <w14:ligatures w14:val="standardContextual"/>
             </w:rPr>
           </w:pPr>
-          <w:hyperlink w:anchor="_Toc224646162" w:history="1">
+          <w:hyperlink w:anchor="_Toc224738232" w:history="1">
             <w:r>
               <w:rPr>
                 <w:rStyle w:val="Hyperlink"/>
@@ -2285,7 +1667,7 @@
                 <w:noProof/>
                 <w:webHidden/>
               </w:rPr>
-              <w:instrText xml:space="preserve"> PAGEREF _Toc224646162 \h </w:instrText>
+              <w:instrText xml:space="preserve"> PAGEREF _Toc224738232 \h </w:instrText>
             </w:r>
             <w:r>
               <w:rPr>
@@ -2305,7 +1687,7 @@
                 <w:noProof/>
                 <w:webHidden/>
               </w:rPr>
-              <w:t>3</w:t>
+              <w:t>4</w:t>
             </w:r>
             <w:r>
               <w:rPr>
@@ -2332,7 +1714,7 @@
               <w14:ligatures w14:val="standardContextual"/>
             </w:rPr>
           </w:pPr>
-          <w:hyperlink w:anchor="_Toc224646163" w:history="1">
+          <w:hyperlink w:anchor="_Toc224738233" w:history="1">
             <w:r>
               <w:rPr>
                 <w:rStyle w:val="Hyperlink"/>
@@ -2359,7 +1741,7 @@
                 <w:noProof/>
                 <w:webHidden/>
               </w:rPr>
-              <w:instrText xml:space="preserve"> PAGEREF _Toc224646163 \h </w:instrText>
+              <w:instrText xml:space="preserve"> PAGEREF _Toc224738233 \h </w:instrText>
             </w:r>
             <w:r>
               <w:rPr>
@@ -2379,7 +1761,7 @@
                 <w:noProof/>
                 <w:webHidden/>
               </w:rPr>
-              <w:t>3</w:t>
+              <w:t>4</w:t>
             </w:r>
             <w:r>
               <w:rPr>
@@ -2406,13 +1788,13 @@
               <w14:ligatures w14:val="standardContextual"/>
             </w:rPr>
           </w:pPr>
-          <w:hyperlink w:anchor="_Toc224646164" w:history="1">
+          <w:hyperlink w:anchor="_Toc224738234" w:history="1">
             <w:r>
               <w:rPr>
                 <w:rStyle w:val="Hyperlink"/>
                 <w:noProof/>
               </w:rPr>
-              <w:t>Chapter 4: System Design &amp; Architecture (~1,500 words)</w:t>
+              <w:t>4. System Design &amp; Architecture (~1,500 words)</w:t>
             </w:r>
             <w:r>
               <w:rPr>
@@ -2433,7 +1815,7 @@
                 <w:noProof/>
                 <w:webHidden/>
               </w:rPr>
-              <w:instrText xml:space="preserve"> PAGEREF _Toc224646164 \h </w:instrText>
+              <w:instrText xml:space="preserve"> PAGEREF _Toc224738234 \h </w:instrText>
             </w:r>
             <w:r>
               <w:rPr>
@@ -2453,7 +1835,7 @@
                 <w:noProof/>
                 <w:webHidden/>
               </w:rPr>
-              <w:t>3</w:t>
+              <w:t>4</w:t>
             </w:r>
             <w:r>
               <w:rPr>
@@ -2480,7 +1862,7 @@
               <w14:ligatures w14:val="standardContextual"/>
             </w:rPr>
           </w:pPr>
-          <w:hyperlink w:anchor="_Toc224646165" w:history="1">
+          <w:hyperlink w:anchor="_Toc224738235" w:history="1">
             <w:r>
               <w:rPr>
                 <w:rStyle w:val="Hyperlink"/>
@@ -2507,7 +1889,7 @@
                 <w:noProof/>
                 <w:webHidden/>
               </w:rPr>
-              <w:instrText xml:space="preserve"> PAGEREF _Toc224646165 \h </w:instrText>
+              <w:instrText xml:space="preserve"> PAGEREF _Toc224738235 \h </w:instrText>
             </w:r>
             <w:r>
               <w:rPr>
@@ -2527,7 +1909,7 @@
                 <w:noProof/>
                 <w:webHidden/>
               </w:rPr>
-              <w:t>3</w:t>
+              <w:t>4</w:t>
             </w:r>
             <w:r>
               <w:rPr>
@@ -2554,7 +1936,7 @@
               <w14:ligatures w14:val="standardContextual"/>
             </w:rPr>
           </w:pPr>
-          <w:hyperlink w:anchor="_Toc224646166" w:history="1">
+          <w:hyperlink w:anchor="_Toc224738236" w:history="1">
             <w:r>
               <w:rPr>
                 <w:rStyle w:val="Hyperlink"/>
@@ -2581,7 +1963,7 @@
                 <w:noProof/>
                 <w:webHidden/>
               </w:rPr>
-              <w:instrText xml:space="preserve"> PAGEREF _Toc224646166 \h </w:instrText>
+              <w:instrText xml:space="preserve"> PAGEREF _Toc224738236 \h </w:instrText>
             </w:r>
             <w:r>
               <w:rPr>
@@ -2628,7 +2010,7 @@
               <w14:ligatures w14:val="standardContextual"/>
             </w:rPr>
           </w:pPr>
-          <w:hyperlink w:anchor="_Toc224646167" w:history="1">
+          <w:hyperlink w:anchor="_Toc224738237" w:history="1">
             <w:r>
               <w:rPr>
                 <w:rStyle w:val="Hyperlink"/>
@@ -2655,7 +2037,7 @@
                 <w:noProof/>
                 <w:webHidden/>
               </w:rPr>
-              <w:instrText xml:space="preserve"> PAGEREF _Toc224646167 \h </w:instrText>
+              <w:instrText xml:space="preserve"> PAGEREF _Toc224738237 \h </w:instrText>
             </w:r>
             <w:r>
               <w:rPr>
@@ -2702,7 +2084,7 @@
               <w14:ligatures w14:val="standardContextual"/>
             </w:rPr>
           </w:pPr>
-          <w:hyperlink w:anchor="_Toc224646168" w:history="1">
+          <w:hyperlink w:anchor="_Toc224738238" w:history="1">
             <w:r>
               <w:rPr>
                 <w:rStyle w:val="Hyperlink"/>
@@ -2729,7 +2111,7 @@
                 <w:noProof/>
                 <w:webHidden/>
               </w:rPr>
-              <w:instrText xml:space="preserve"> PAGEREF _Toc224646168 \h </w:instrText>
+              <w:instrText xml:space="preserve"> PAGEREF _Toc224738238 \h </w:instrText>
             </w:r>
             <w:r>
               <w:rPr>
@@ -2776,13 +2158,13 @@
               <w14:ligatures w14:val="standardContextual"/>
             </w:rPr>
           </w:pPr>
-          <w:hyperlink w:anchor="_Toc224646169" w:history="1">
+          <w:hyperlink w:anchor="_Toc224738239" w:history="1">
             <w:r>
               <w:rPr>
                 <w:rStyle w:val="Hyperlink"/>
                 <w:noProof/>
               </w:rPr>
-              <w:t>Chapter 5: Implementation (~2,000 words)</w:t>
+              <w:t>5. Implementation (~2,000 words)</w:t>
             </w:r>
             <w:r>
               <w:rPr>
@@ -2803,7 +2185,7 @@
                 <w:noProof/>
                 <w:webHidden/>
               </w:rPr>
-              <w:instrText xml:space="preserve"> PAGEREF _Toc224646169 \h </w:instrText>
+              <w:instrText xml:space="preserve"> PAGEREF _Toc224738239 \h </w:instrText>
             </w:r>
             <w:r>
               <w:rPr>
@@ -2850,7 +2232,7 @@
               <w14:ligatures w14:val="standardContextual"/>
             </w:rPr>
           </w:pPr>
-          <w:hyperlink w:anchor="_Toc224646170" w:history="1">
+          <w:hyperlink w:anchor="_Toc224738240" w:history="1">
             <w:r>
               <w:rPr>
                 <w:rStyle w:val="Hyperlink"/>
@@ -2877,7 +2259,7 @@
                 <w:noProof/>
                 <w:webHidden/>
               </w:rPr>
-              <w:instrText xml:space="preserve"> PAGEREF _Toc224646170 \h </w:instrText>
+              <w:instrText xml:space="preserve"> PAGEREF _Toc224738240 \h </w:instrText>
             </w:r>
             <w:r>
               <w:rPr>
@@ -2924,7 +2306,7 @@
               <w14:ligatures w14:val="standardContextual"/>
             </w:rPr>
           </w:pPr>
-          <w:hyperlink w:anchor="_Toc224646171" w:history="1">
+          <w:hyperlink w:anchor="_Toc224738241" w:history="1">
             <w:r>
               <w:rPr>
                 <w:rStyle w:val="Hyperlink"/>
@@ -2951,7 +2333,7 @@
                 <w:noProof/>
                 <w:webHidden/>
               </w:rPr>
-              <w:instrText xml:space="preserve"> PAGEREF _Toc224646171 \h </w:instrText>
+              <w:instrText xml:space="preserve"> PAGEREF _Toc224738241 \h </w:instrText>
             </w:r>
             <w:r>
               <w:rPr>
@@ -2998,7 +2380,7 @@
               <w14:ligatures w14:val="standardContextual"/>
             </w:rPr>
           </w:pPr>
-          <w:hyperlink w:anchor="_Toc224646172" w:history="1">
+          <w:hyperlink w:anchor="_Toc224738242" w:history="1">
             <w:r>
               <w:rPr>
                 <w:rStyle w:val="Hyperlink"/>
@@ -3025,7 +2407,7 @@
                 <w:noProof/>
                 <w:webHidden/>
               </w:rPr>
-              <w:instrText xml:space="preserve"> PAGEREF _Toc224646172 \h </w:instrText>
+              <w:instrText xml:space="preserve"> PAGEREF _Toc224738242 \h </w:instrText>
             </w:r>
             <w:r>
               <w:rPr>
@@ -3045,7 +2427,7 @@
                 <w:noProof/>
                 <w:webHidden/>
               </w:rPr>
-              <w:t>4</w:t>
+              <w:t>5</w:t>
             </w:r>
             <w:r>
               <w:rPr>
@@ -3072,7 +2454,7 @@
               <w14:ligatures w14:val="standardContextual"/>
             </w:rPr>
           </w:pPr>
-          <w:hyperlink w:anchor="_Toc224646173" w:history="1">
+          <w:hyperlink w:anchor="_Toc224738243" w:history="1">
             <w:r>
               <w:rPr>
                 <w:rStyle w:val="Hyperlink"/>
@@ -3099,7 +2481,7 @@
                 <w:noProof/>
                 <w:webHidden/>
               </w:rPr>
-              <w:instrText xml:space="preserve"> PAGEREF _Toc224646173 \h </w:instrText>
+              <w:instrText xml:space="preserve"> PAGEREF _Toc224738243 \h </w:instrText>
             </w:r>
             <w:r>
               <w:rPr>
@@ -3119,7 +2501,7 @@
                 <w:noProof/>
                 <w:webHidden/>
               </w:rPr>
-              <w:t>4</w:t>
+              <w:t>5</w:t>
             </w:r>
             <w:r>
               <w:rPr>
@@ -3146,7 +2528,7 @@
               <w14:ligatures w14:val="standardContextual"/>
             </w:rPr>
           </w:pPr>
-          <w:hyperlink w:anchor="_Toc224646174" w:history="1">
+          <w:hyperlink w:anchor="_Toc224738244" w:history="1">
             <w:r>
               <w:rPr>
                 <w:rStyle w:val="Hyperlink"/>
@@ -3173,7 +2555,7 @@
                 <w:noProof/>
                 <w:webHidden/>
               </w:rPr>
-              <w:instrText xml:space="preserve"> PAGEREF _Toc224646174 \h </w:instrText>
+              <w:instrText xml:space="preserve"> PAGEREF _Toc224738244 \h </w:instrText>
             </w:r>
             <w:r>
               <w:rPr>
@@ -3193,7 +2575,7 @@
                 <w:noProof/>
                 <w:webHidden/>
               </w:rPr>
-              <w:t>4</w:t>
+              <w:t>5</w:t>
             </w:r>
             <w:r>
               <w:rPr>
@@ -3220,13 +2602,13 @@
               <w14:ligatures w14:val="standardContextual"/>
             </w:rPr>
           </w:pPr>
-          <w:hyperlink w:anchor="_Toc224646175" w:history="1">
+          <w:hyperlink w:anchor="_Toc224738245" w:history="1">
             <w:r>
               <w:rPr>
                 <w:rStyle w:val="Hyperlink"/>
                 <w:noProof/>
               </w:rPr>
-              <w:t>Chapter 6: Testing &amp; Evaluation (~1,500 words)</w:t>
+              <w:t>6. Testing &amp; Evaluation (~1,500 words)</w:t>
             </w:r>
             <w:r>
               <w:rPr>
@@ -3247,7 +2629,7 @@
                 <w:noProof/>
                 <w:webHidden/>
               </w:rPr>
-              <w:instrText xml:space="preserve"> PAGEREF _Toc224646175 \h </w:instrText>
+              <w:instrText xml:space="preserve"> PAGEREF _Toc224738245 \h </w:instrText>
             </w:r>
             <w:r>
               <w:rPr>
@@ -3267,7 +2649,7 @@
                 <w:noProof/>
                 <w:webHidden/>
               </w:rPr>
-              <w:t>4</w:t>
+              <w:t>5</w:t>
             </w:r>
             <w:r>
               <w:rPr>
@@ -3294,7 +2676,7 @@
               <w14:ligatures w14:val="standardContextual"/>
             </w:rPr>
           </w:pPr>
-          <w:hyperlink w:anchor="_Toc224646176" w:history="1">
+          <w:hyperlink w:anchor="_Toc224738246" w:history="1">
             <w:r>
               <w:rPr>
                 <w:rStyle w:val="Hyperlink"/>
@@ -3321,7 +2703,7 @@
                 <w:noProof/>
                 <w:webHidden/>
               </w:rPr>
-              <w:instrText xml:space="preserve"> PAGEREF _Toc224646176 \h </w:instrText>
+              <w:instrText xml:space="preserve"> PAGEREF _Toc224738246 \h </w:instrText>
             </w:r>
             <w:r>
               <w:rPr>
@@ -3341,7 +2723,7 @@
                 <w:noProof/>
                 <w:webHidden/>
               </w:rPr>
-              <w:t>4</w:t>
+              <w:t>5</w:t>
             </w:r>
             <w:r>
               <w:rPr>
@@ -3368,7 +2750,7 @@
               <w14:ligatures w14:val="standardContextual"/>
             </w:rPr>
           </w:pPr>
-          <w:hyperlink w:anchor="_Toc224646177" w:history="1">
+          <w:hyperlink w:anchor="_Toc224738247" w:history="1">
             <w:r>
               <w:rPr>
                 <w:rStyle w:val="Hyperlink"/>
@@ -3395,7 +2777,7 @@
                 <w:noProof/>
                 <w:webHidden/>
               </w:rPr>
-              <w:instrText xml:space="preserve"> PAGEREF _Toc224646177 \h </w:instrText>
+              <w:instrText xml:space="preserve"> PAGEREF _Toc224738247 \h </w:instrText>
             </w:r>
             <w:r>
               <w:rPr>
@@ -3415,7 +2797,7 @@
                 <w:noProof/>
                 <w:webHidden/>
               </w:rPr>
-              <w:t>4</w:t>
+              <w:t>5</w:t>
             </w:r>
             <w:r>
               <w:rPr>
@@ -3442,7 +2824,7 @@
               <w14:ligatures w14:val="standardContextual"/>
             </w:rPr>
           </w:pPr>
-          <w:hyperlink w:anchor="_Toc224646178" w:history="1">
+          <w:hyperlink w:anchor="_Toc224738248" w:history="1">
             <w:r>
               <w:rPr>
                 <w:rStyle w:val="Hyperlink"/>
@@ -3469,7 +2851,7 @@
                 <w:noProof/>
                 <w:webHidden/>
               </w:rPr>
-              <w:instrText xml:space="preserve"> PAGEREF _Toc224646178 \h </w:instrText>
+              <w:instrText xml:space="preserve"> PAGEREF _Toc224738248 \h </w:instrText>
             </w:r>
             <w:r>
               <w:rPr>
@@ -3516,7 +2898,7 @@
               <w14:ligatures w14:val="standardContextual"/>
             </w:rPr>
           </w:pPr>
-          <w:hyperlink w:anchor="_Toc224646179" w:history="1">
+          <w:hyperlink w:anchor="_Toc224738249" w:history="1">
             <w:r>
               <w:rPr>
                 <w:rStyle w:val="Hyperlink"/>
@@ -3543,7 +2925,7 @@
                 <w:noProof/>
                 <w:webHidden/>
               </w:rPr>
-              <w:instrText xml:space="preserve"> PAGEREF _Toc224646179 \h </w:instrText>
+              <w:instrText xml:space="preserve"> PAGEREF _Toc224738249 \h </w:instrText>
             </w:r>
             <w:r>
               <w:rPr>
@@ -3590,13 +2972,13 @@
               <w14:ligatures w14:val="standardContextual"/>
             </w:rPr>
           </w:pPr>
-          <w:hyperlink w:anchor="_Toc224646180" w:history="1">
+          <w:hyperlink w:anchor="_Toc224738250" w:history="1">
             <w:r>
               <w:rPr>
                 <w:rStyle w:val="Hyperlink"/>
                 <w:noProof/>
               </w:rPr>
-              <w:t>Chapter 7: Conclusion &amp; Future Work (~1,000 words)</w:t>
+              <w:t>7. Conclusion &amp; Future Work (~1,000 words)</w:t>
             </w:r>
             <w:r>
               <w:rPr>
@@ -3617,7 +2999,7 @@
                 <w:noProof/>
                 <w:webHidden/>
               </w:rPr>
-              <w:instrText xml:space="preserve"> PAGEREF _Toc224646180 \h </w:instrText>
+              <w:instrText xml:space="preserve"> PAGEREF _Toc224738250 \h </w:instrText>
             </w:r>
             <w:r>
               <w:rPr>
@@ -3664,7 +3046,7 @@
               <w14:ligatures w14:val="standardContextual"/>
             </w:rPr>
           </w:pPr>
-          <w:hyperlink w:anchor="_Toc224646181" w:history="1">
+          <w:hyperlink w:anchor="_Toc224738251" w:history="1">
             <w:r>
               <w:rPr>
                 <w:rStyle w:val="Hyperlink"/>
@@ -3691,7 +3073,7 @@
                 <w:noProof/>
                 <w:webHidden/>
               </w:rPr>
-              <w:instrText xml:space="preserve"> PAGEREF _Toc224646181 \h </w:instrText>
+              <w:instrText xml:space="preserve"> PAGEREF _Toc224738251 \h </w:instrText>
             </w:r>
             <w:r>
               <w:rPr>
@@ -3738,7 +3120,7 @@
               <w14:ligatures w14:val="standardContextual"/>
             </w:rPr>
           </w:pPr>
-          <w:hyperlink w:anchor="_Toc224646182" w:history="1">
+          <w:hyperlink w:anchor="_Toc224738252" w:history="1">
             <w:r>
               <w:rPr>
                 <w:rStyle w:val="Hyperlink"/>
@@ -3765,7 +3147,7 @@
                 <w:noProof/>
                 <w:webHidden/>
               </w:rPr>
-              <w:instrText xml:space="preserve"> PAGEREF _Toc224646182 \h </w:instrText>
+              <w:instrText xml:space="preserve"> PAGEREF _Toc224738252 \h </w:instrText>
             </w:r>
             <w:r>
               <w:rPr>
@@ -3812,7 +3194,7 @@
               <w14:ligatures w14:val="standardContextual"/>
             </w:rPr>
           </w:pPr>
-          <w:hyperlink w:anchor="_Toc224646183" w:history="1">
+          <w:hyperlink w:anchor="_Toc224738253" w:history="1">
             <w:r>
               <w:rPr>
                 <w:rStyle w:val="Hyperlink"/>
@@ -3839,7 +3221,7 @@
                 <w:noProof/>
                 <w:webHidden/>
               </w:rPr>
-              <w:instrText xml:space="preserve"> PAGEREF _Toc224646183 \h </w:instrText>
+              <w:instrText xml:space="preserve"> PAGEREF _Toc224738253 \h </w:instrText>
             </w:r>
             <w:r>
               <w:rPr>
@@ -3886,7 +3268,7 @@
               <w14:ligatures w14:val="standardContextual"/>
             </w:rPr>
           </w:pPr>
-          <w:hyperlink w:anchor="_Toc224646184" w:history="1">
+          <w:hyperlink w:anchor="_Toc224738254" w:history="1">
             <w:r>
               <w:rPr>
                 <w:rStyle w:val="Hyperlink"/>
@@ -3913,7 +3295,7 @@
                 <w:noProof/>
                 <w:webHidden/>
               </w:rPr>
-              <w:instrText xml:space="preserve"> PAGEREF _Toc224646184 \h </w:instrText>
+              <w:instrText xml:space="preserve"> PAGEREF _Toc224738254 \h </w:instrText>
             </w:r>
             <w:r>
               <w:rPr>
@@ -3933,7 +3315,7 @@
                 <w:noProof/>
                 <w:webHidden/>
               </w:rPr>
-              <w:t>5</w:t>
+              <w:t>6</w:t>
             </w:r>
             <w:r>
               <w:rPr>
@@ -3960,7 +3342,7 @@
               <w14:ligatures w14:val="standardContextual"/>
             </w:rPr>
           </w:pPr>
-          <w:hyperlink w:anchor="_Toc224646185" w:history="1">
+          <w:hyperlink w:anchor="_Toc224738255" w:history="1">
             <w:r>
               <w:rPr>
                 <w:rStyle w:val="Hyperlink"/>
@@ -3987,7 +3369,7 @@
                 <w:noProof/>
                 <w:webHidden/>
               </w:rPr>
-              <w:instrText xml:space="preserve"> PAGEREF _Toc224646185 \h </w:instrText>
+              <w:instrText xml:space="preserve"> PAGEREF _Toc224738255 \h </w:instrText>
             </w:r>
             <w:r>
               <w:rPr>
@@ -4007,7 +3389,7 @@
                 <w:noProof/>
                 <w:webHidden/>
               </w:rPr>
-              <w:t>5</w:t>
+              <w:t>6</w:t>
             </w:r>
             <w:r>
               <w:rPr>
@@ -4034,7 +3416,7 @@
               <w14:ligatures w14:val="standardContextual"/>
             </w:rPr>
           </w:pPr>
-          <w:hyperlink w:anchor="_Toc224646186" w:history="1">
+          <w:hyperlink w:anchor="_Toc224738256" w:history="1">
             <w:r>
               <w:rPr>
                 <w:rStyle w:val="Hyperlink"/>
@@ -4061,7 +3443,7 @@
                 <w:noProof/>
                 <w:webHidden/>
               </w:rPr>
-              <w:instrText xml:space="preserve"> PAGEREF _Toc224646186 \h </w:instrText>
+              <w:instrText xml:space="preserve"> PAGEREF _Toc224738256 \h </w:instrText>
             </w:r>
             <w:r>
               <w:rPr>
@@ -4081,7 +3463,7 @@
                 <w:noProof/>
                 <w:webHidden/>
               </w:rPr>
-              <w:t>5</w:t>
+              <w:t>6</w:t>
             </w:r>
             <w:r>
               <w:rPr>
@@ -4107,19 +3489,100 @@
     <w:p>
       <w:r>
         <w:pict w14:anchorId="2105E11A">
-          <v:rect id="_x0000_i1037" style="width:0;height:1.5pt" o:hralign="center" o:hrstd="t" o:hr="t" fillcolor="#a0a0a0" stroked="f"/>
+          <v:rect id="_x0000_i1035" style="width:0;height:1.5pt" o:hralign="center" o:bullet="t" o:hrstd="t" o:hr="t" fillcolor="#a0a0a0" stroked="f"/>
         </w:pict>
       </w:r>
     </w:p>
+    <w:p/>
     <w:p>
       <w:pPr>
         <w:pStyle w:val="Heading1"/>
-      </w:pPr>
-      <w:bookmarkStart w:id="2" w:name="_Toc224646149"/>
-      <w:r>
-        <w:t>Chapter 1: Introduction (~1,000 words)</w:t>
+        <w:rPr>
+          <w:sz w:val="32"/>
+          <w:szCs w:val="32"/>
+        </w:rPr>
+      </w:pPr>
+      <w:bookmarkStart w:id="2" w:name="_Toc224738217"/>
+      <w:r>
+        <w:rPr>
+          <w:sz w:val="32"/>
+          <w:szCs w:val="32"/>
+        </w:rPr>
+        <w:lastRenderedPageBreak/>
+        <w:t>Word Count</w:t>
       </w:r>
       <w:bookmarkEnd w:id="2"/>
+      <w:r>
+        <w:rPr>
+          <w:sz w:val="32"/>
+          <w:szCs w:val="32"/>
+        </w:rPr>
+        <w:t xml:space="preserve"> </w:t>
+      </w:r>
+    </w:p>
+    <w:p>
+      <w:r>
+        <w:t>Words:</w:t>
+      </w:r>
+    </w:p>
+    <w:p>
+      <w:pPr>
+        <w:pStyle w:val="Heading1"/>
+        <w:rPr>
+          <w:sz w:val="32"/>
+          <w:szCs w:val="32"/>
+        </w:rPr>
+      </w:pPr>
+      <w:bookmarkStart w:id="3" w:name="_Toc224738218"/>
+      <w:proofErr w:type="spellStart"/>
+      <w:r>
+        <w:rPr>
+          <w:sz w:val="32"/>
+          <w:szCs w:val="32"/>
+        </w:rPr>
+        <w:t>Github</w:t>
+      </w:r>
+      <w:proofErr w:type="spellEnd"/>
+      <w:r>
+        <w:rPr>
+          <w:sz w:val="32"/>
+          <w:szCs w:val="32"/>
+        </w:rPr>
+        <w:t xml:space="preserve"> Repo</w:t>
+      </w:r>
+      <w:bookmarkEnd w:id="3"/>
+    </w:p>
+    <w:p>
+      <w:pPr>
+        <w:pStyle w:val="Heading1"/>
+        <w:rPr>
+          <w:sz w:val="32"/>
+          <w:szCs w:val="32"/>
+        </w:rPr>
+      </w:pPr>
+      <w:bookmarkStart w:id="4" w:name="_Toc224738219"/>
+      <w:r>
+        <w:rPr>
+          <w:sz w:val="32"/>
+          <w:szCs w:val="32"/>
+        </w:rPr>
+        <w:t>1</w:t>
+      </w:r>
+      <w:r>
+        <w:rPr>
+          <w:sz w:val="32"/>
+          <w:szCs w:val="32"/>
+        </w:rPr>
+        <w:t>.</w:t>
+      </w:r>
+      <w:r>
+        <w:rPr>
+          <w:sz w:val="32"/>
+          <w:szCs w:val="32"/>
+        </w:rPr>
+        <w:t xml:space="preserve"> Introduction (~1,000 words)</w:t>
+      </w:r>
+      <w:bookmarkEnd w:id="4"/>
     </w:p>
     <w:p>
       <w:pPr>
@@ -4139,12 +3602,20 @@
     <w:p>
       <w:pPr>
         <w:pStyle w:val="Heading2"/>
-      </w:pPr>
-      <w:bookmarkStart w:id="3" w:name="_Toc224646150"/>
-      <w:r>
+        <w:rPr>
+          <w:sz w:val="28"/>
+          <w:szCs w:val="28"/>
+        </w:rPr>
+      </w:pPr>
+      <w:bookmarkStart w:id="5" w:name="_Toc224738220"/>
+      <w:r>
+        <w:rPr>
+          <w:sz w:val="28"/>
+          <w:szCs w:val="28"/>
+        </w:rPr>
         <w:t>1.1 Background</w:t>
       </w:r>
-      <w:bookmarkEnd w:id="3"/>
+      <w:bookmarkEnd w:id="5"/>
     </w:p>
     <w:p>
       <w:pPr>
@@ -4163,12 +3634,20 @@
     <w:p>
       <w:pPr>
         <w:pStyle w:val="Heading2"/>
-      </w:pPr>
-      <w:bookmarkStart w:id="4" w:name="_Toc224646151"/>
-      <w:r>
+        <w:rPr>
+          <w:sz w:val="28"/>
+          <w:szCs w:val="28"/>
+        </w:rPr>
+      </w:pPr>
+      <w:bookmarkStart w:id="6" w:name="_Toc224738221"/>
+      <w:r>
+        <w:rPr>
+          <w:sz w:val="28"/>
+          <w:szCs w:val="28"/>
+        </w:rPr>
         <w:t>1.2 Problem Statement</w:t>
       </w:r>
-      <w:bookmarkEnd w:id="4"/>
+      <w:bookmarkEnd w:id="6"/>
     </w:p>
     <w:p>
       <w:r>
@@ -4178,12 +3657,20 @@
     <w:p>
       <w:pPr>
         <w:pStyle w:val="Heading2"/>
-      </w:pPr>
-      <w:bookmarkStart w:id="5" w:name="_Toc224646152"/>
-      <w:r>
+        <w:rPr>
+          <w:sz w:val="28"/>
+          <w:szCs w:val="28"/>
+        </w:rPr>
+      </w:pPr>
+      <w:bookmarkStart w:id="7" w:name="_Toc224738222"/>
+      <w:r>
+        <w:rPr>
+          <w:sz w:val="28"/>
+          <w:szCs w:val="28"/>
+        </w:rPr>
         <w:t>1.3 Aims and Objectives</w:t>
       </w:r>
-      <w:bookmarkEnd w:id="5"/>
+      <w:bookmarkEnd w:id="7"/>
     </w:p>
     <w:p>
       <w:r>
@@ -4212,16 +3699,32 @@
     <w:p>
       <w:pPr>
         <w:pStyle w:val="Heading2"/>
-      </w:pPr>
-      <w:bookmarkStart w:id="6" w:name="_Toc224646153"/>
-      <w:r>
+        <w:rPr>
+          <w:sz w:val="28"/>
+          <w:szCs w:val="28"/>
+        </w:rPr>
+      </w:pPr>
+      <w:bookmarkStart w:id="8" w:name="_Toc224738223"/>
+      <w:r>
+        <w:rPr>
+          <w:sz w:val="28"/>
+          <w:szCs w:val="28"/>
+        </w:rPr>
         <w:t xml:space="preserve">1.4 </w:t>
       </w:r>
       <w:r>
+        <w:rPr>
+          <w:sz w:val="28"/>
+          <w:szCs w:val="28"/>
+        </w:rPr>
         <w:t>Scope and Constraints</w:t>
       </w:r>
-      <w:bookmarkEnd w:id="6"/>
-      <w:r>
+      <w:bookmarkEnd w:id="8"/>
+      <w:r>
+        <w:rPr>
+          <w:sz w:val="28"/>
+          <w:szCs w:val="28"/>
+        </w:rPr>
         <w:t xml:space="preserve"> </w:t>
       </w:r>
     </w:p>
@@ -4253,12 +3756,34 @@
     <w:p>
       <w:pPr>
         <w:pStyle w:val="Heading1"/>
-      </w:pPr>
-      <w:bookmarkStart w:id="7" w:name="_Toc224646154"/>
-      <w:r>
-        <w:t>Chapter 2: Literature Review &amp; Technologies (~2,000 words)</w:t>
-      </w:r>
-      <w:bookmarkEnd w:id="7"/>
+        <w:rPr>
+          <w:sz w:val="32"/>
+          <w:szCs w:val="32"/>
+        </w:rPr>
+      </w:pPr>
+      <w:bookmarkStart w:id="9" w:name="_Toc224738224"/>
+      <w:r>
+        <w:rPr>
+          <w:sz w:val="32"/>
+          <w:szCs w:val="32"/>
+        </w:rPr>
+        <w:t>2</w:t>
+      </w:r>
+      <w:r>
+        <w:rPr>
+          <w:sz w:val="32"/>
+          <w:szCs w:val="32"/>
+        </w:rPr>
+        <w:t xml:space="preserve">. </w:t>
+      </w:r>
+      <w:r>
+        <w:rPr>
+          <w:sz w:val="32"/>
+          <w:szCs w:val="32"/>
+        </w:rPr>
+        <w:t>Literature Review &amp; Technologies (~2,000 words)</w:t>
+      </w:r>
+      <w:bookmarkEnd w:id="9"/>
     </w:p>
     <w:p>
       <w:pPr>
@@ -4285,13 +3810,20 @@
     <w:p>
       <w:pPr>
         <w:pStyle w:val="Heading2"/>
-      </w:pPr>
-      <w:bookmarkStart w:id="8" w:name="_Toc224646155"/>
-      <w:r>
-        <w:lastRenderedPageBreak/>
+        <w:rPr>
+          <w:sz w:val="28"/>
+          <w:szCs w:val="28"/>
+        </w:rPr>
+      </w:pPr>
+      <w:bookmarkStart w:id="10" w:name="_Toc224738225"/>
+      <w:r>
+        <w:rPr>
+          <w:sz w:val="28"/>
+          <w:szCs w:val="28"/>
+        </w:rPr>
         <w:t>2.1 The Cybersecurity Landscape for SMEs</w:t>
       </w:r>
-      <w:bookmarkEnd w:id="8"/>
+      <w:bookmarkEnd w:id="10"/>
     </w:p>
     <w:p>
       <w:r>
@@ -4301,12 +3833,20 @@
     <w:p>
       <w:pPr>
         <w:pStyle w:val="Heading2"/>
-      </w:pPr>
-      <w:bookmarkStart w:id="9" w:name="_Toc224646156"/>
-      <w:r>
+        <w:rPr>
+          <w:sz w:val="28"/>
+          <w:szCs w:val="28"/>
+        </w:rPr>
+      </w:pPr>
+      <w:bookmarkStart w:id="11" w:name="_Toc224738226"/>
+      <w:r>
+        <w:rPr>
+          <w:sz w:val="28"/>
+          <w:szCs w:val="28"/>
+        </w:rPr>
         <w:t>2.2 Existing Solutions vs. S.I.R.A.</w:t>
       </w:r>
-      <w:bookmarkEnd w:id="9"/>
+      <w:bookmarkEnd w:id="11"/>
     </w:p>
     <w:p>
       <w:r>
@@ -4324,12 +3864,20 @@
     <w:p>
       <w:pPr>
         <w:pStyle w:val="Heading2"/>
-      </w:pPr>
-      <w:bookmarkStart w:id="10" w:name="_Toc224646157"/>
-      <w:r>
+        <w:rPr>
+          <w:sz w:val="28"/>
+          <w:szCs w:val="28"/>
+        </w:rPr>
+      </w:pPr>
+      <w:bookmarkStart w:id="12" w:name="_Toc224738227"/>
+      <w:r>
+        <w:rPr>
+          <w:sz w:val="28"/>
+          <w:szCs w:val="28"/>
+        </w:rPr>
         <w:t>2.3 The Role of LLMs in Security</w:t>
       </w:r>
-      <w:bookmarkEnd w:id="10"/>
+      <w:bookmarkEnd w:id="12"/>
     </w:p>
     <w:p>
       <w:r>
@@ -4339,12 +3887,20 @@
     <w:p>
       <w:pPr>
         <w:pStyle w:val="Heading2"/>
-      </w:pPr>
-      <w:bookmarkStart w:id="11" w:name="_Toc224646158"/>
-      <w:r>
+        <w:rPr>
+          <w:sz w:val="28"/>
+          <w:szCs w:val="28"/>
+        </w:rPr>
+      </w:pPr>
+      <w:bookmarkStart w:id="13" w:name="_Toc224738228"/>
+      <w:r>
+        <w:rPr>
+          <w:sz w:val="28"/>
+          <w:szCs w:val="28"/>
+        </w:rPr>
         <w:t>2.4 Technology Stack Justification</w:t>
       </w:r>
-      <w:bookmarkEnd w:id="11"/>
+      <w:bookmarkEnd w:id="13"/>
     </w:p>
     <w:p>
       <w:r>
@@ -4416,12 +3972,28 @@
     <w:p>
       <w:pPr>
         <w:pStyle w:val="Heading1"/>
-      </w:pPr>
-      <w:bookmarkStart w:id="12" w:name="_Toc224646159"/>
-      <w:r>
-        <w:t>Chapter 3: Requirements &amp; Specification (~1,000 words)</w:t>
-      </w:r>
-      <w:bookmarkEnd w:id="12"/>
+        <w:rPr>
+          <w:sz w:val="32"/>
+          <w:szCs w:val="32"/>
+        </w:rPr>
+      </w:pPr>
+      <w:bookmarkStart w:id="14" w:name="_Toc224738229"/>
+      <w:r>
+        <w:rPr>
+          <w:sz w:val="32"/>
+          <w:szCs w:val="32"/>
+        </w:rPr>
+        <w:lastRenderedPageBreak/>
+        <w:t>3.</w:t>
+      </w:r>
+      <w:r>
+        <w:rPr>
+          <w:sz w:val="32"/>
+          <w:szCs w:val="32"/>
+        </w:rPr>
+        <w:t xml:space="preserve"> Requirements &amp; Specification (~1,000 words)</w:t>
+      </w:r>
+      <w:bookmarkEnd w:id="14"/>
     </w:p>
     <w:p>
       <w:r>
@@ -4435,12 +4007,20 @@
     <w:p>
       <w:pPr>
         <w:pStyle w:val="Heading2"/>
-      </w:pPr>
-      <w:bookmarkStart w:id="13" w:name="_Toc224646160"/>
-      <w:r>
+        <w:rPr>
+          <w:sz w:val="28"/>
+          <w:szCs w:val="28"/>
+        </w:rPr>
+      </w:pPr>
+      <w:bookmarkStart w:id="15" w:name="_Toc224738230"/>
+      <w:r>
+        <w:rPr>
+          <w:sz w:val="28"/>
+          <w:szCs w:val="28"/>
+        </w:rPr>
         <w:t>3.1 Target Audience / Personas</w:t>
       </w:r>
-      <w:bookmarkEnd w:id="13"/>
+      <w:bookmarkEnd w:id="15"/>
     </w:p>
     <w:p>
       <w:r>
@@ -4450,12 +4030,20 @@
     <w:p>
       <w:pPr>
         <w:pStyle w:val="Heading2"/>
-      </w:pPr>
-      <w:bookmarkStart w:id="14" w:name="_Toc224646161"/>
-      <w:r>
+        <w:rPr>
+          <w:sz w:val="28"/>
+          <w:szCs w:val="28"/>
+        </w:rPr>
+      </w:pPr>
+      <w:bookmarkStart w:id="16" w:name="_Toc224738231"/>
+      <w:r>
+        <w:rPr>
+          <w:sz w:val="28"/>
+          <w:szCs w:val="28"/>
+        </w:rPr>
         <w:t>3.2 Requirement Elicitation</w:t>
       </w:r>
-      <w:bookmarkEnd w:id="14"/>
+      <w:bookmarkEnd w:id="16"/>
     </w:p>
     <w:p>
       <w:r>
@@ -4465,12 +4053,20 @@
     <w:p>
       <w:pPr>
         <w:pStyle w:val="Heading2"/>
-      </w:pPr>
-      <w:bookmarkStart w:id="15" w:name="_Toc224646162"/>
-      <w:r>
+        <w:rPr>
+          <w:sz w:val="28"/>
+          <w:szCs w:val="28"/>
+        </w:rPr>
+      </w:pPr>
+      <w:bookmarkStart w:id="17" w:name="_Toc224738232"/>
+      <w:r>
+        <w:rPr>
+          <w:sz w:val="28"/>
+          <w:szCs w:val="28"/>
+        </w:rPr>
         <w:t>3.3 Functional Requirements</w:t>
       </w:r>
-      <w:bookmarkEnd w:id="15"/>
+      <w:bookmarkEnd w:id="17"/>
     </w:p>
     <w:p>
       <w:r>
@@ -4504,12 +4100,20 @@
     <w:p>
       <w:pPr>
         <w:pStyle w:val="Heading2"/>
-      </w:pPr>
-      <w:bookmarkStart w:id="16" w:name="_Toc224646163"/>
-      <w:r>
+        <w:rPr>
+          <w:sz w:val="28"/>
+          <w:szCs w:val="28"/>
+        </w:rPr>
+      </w:pPr>
+      <w:bookmarkStart w:id="18" w:name="_Toc224738233"/>
+      <w:r>
+        <w:rPr>
+          <w:sz w:val="28"/>
+          <w:szCs w:val="28"/>
+        </w:rPr>
         <w:t>3.4 Non-Functional Requirements</w:t>
       </w:r>
-      <w:bookmarkEnd w:id="16"/>
+      <w:bookmarkEnd w:id="18"/>
     </w:p>
     <w:p>
       <w:r>
@@ -4519,12 +4123,27 @@
     <w:p>
       <w:pPr>
         <w:pStyle w:val="Heading1"/>
-      </w:pPr>
-      <w:bookmarkStart w:id="17" w:name="_Toc224646164"/>
-      <w:r>
-        <w:t>Chapter 4: System Design &amp; Architecture (~1,500 words)</w:t>
-      </w:r>
-      <w:bookmarkEnd w:id="17"/>
+        <w:rPr>
+          <w:sz w:val="32"/>
+          <w:szCs w:val="32"/>
+        </w:rPr>
+      </w:pPr>
+      <w:bookmarkStart w:id="19" w:name="_Toc224738234"/>
+      <w:r>
+        <w:rPr>
+          <w:sz w:val="32"/>
+          <w:szCs w:val="32"/>
+        </w:rPr>
+        <w:t>4.</w:t>
+      </w:r>
+      <w:r>
+        <w:rPr>
+          <w:sz w:val="32"/>
+          <w:szCs w:val="32"/>
+        </w:rPr>
+        <w:t xml:space="preserve"> System Design &amp; Architecture (~1,500 words)</w:t>
+      </w:r>
+      <w:bookmarkEnd w:id="19"/>
     </w:p>
     <w:p>
       <w:r>
@@ -4538,12 +4157,20 @@
     <w:p>
       <w:pPr>
         <w:pStyle w:val="Heading2"/>
-      </w:pPr>
-      <w:bookmarkStart w:id="18" w:name="_Toc224646165"/>
-      <w:r>
+        <w:rPr>
+          <w:sz w:val="28"/>
+          <w:szCs w:val="28"/>
+        </w:rPr>
+      </w:pPr>
+      <w:bookmarkStart w:id="20" w:name="_Toc224738235"/>
+      <w:r>
+        <w:rPr>
+          <w:sz w:val="28"/>
+          <w:szCs w:val="28"/>
+        </w:rPr>
         <w:t>4.1 High-Level Architecture</w:t>
       </w:r>
-      <w:bookmarkEnd w:id="18"/>
+      <w:bookmarkEnd w:id="20"/>
     </w:p>
     <w:p>
       <w:r>
@@ -4561,13 +4188,20 @@
     <w:p>
       <w:pPr>
         <w:pStyle w:val="Heading2"/>
-      </w:pPr>
-      <w:bookmarkStart w:id="19" w:name="_Toc224646166"/>
-      <w:r>
-        <w:lastRenderedPageBreak/>
+        <w:rPr>
+          <w:sz w:val="28"/>
+          <w:szCs w:val="28"/>
+        </w:rPr>
+      </w:pPr>
+      <w:bookmarkStart w:id="21" w:name="_Toc224738236"/>
+      <w:r>
+        <w:rPr>
+          <w:sz w:val="28"/>
+          <w:szCs w:val="28"/>
+        </w:rPr>
         <w:t>4.2 Database Design</w:t>
       </w:r>
-      <w:bookmarkEnd w:id="19"/>
+      <w:bookmarkEnd w:id="21"/>
     </w:p>
     <w:p>
       <w:r>
@@ -4593,12 +4227,20 @@
     <w:p>
       <w:pPr>
         <w:pStyle w:val="Heading2"/>
-      </w:pPr>
-      <w:bookmarkStart w:id="20" w:name="_Toc224646167"/>
-      <w:r>
+        <w:rPr>
+          <w:sz w:val="28"/>
+          <w:szCs w:val="28"/>
+        </w:rPr>
+      </w:pPr>
+      <w:bookmarkStart w:id="22" w:name="_Toc224738237"/>
+      <w:r>
+        <w:rPr>
+          <w:sz w:val="28"/>
+          <w:szCs w:val="28"/>
+        </w:rPr>
         <w:t>4.3 Security &amp; Privacy Design</w:t>
       </w:r>
-      <w:bookmarkEnd w:id="20"/>
+      <w:bookmarkEnd w:id="22"/>
     </w:p>
     <w:p>
       <w:r>
@@ -4608,12 +4250,20 @@
     <w:p>
       <w:pPr>
         <w:pStyle w:val="Heading2"/>
-      </w:pPr>
-      <w:bookmarkStart w:id="21" w:name="_Toc224646168"/>
-      <w:r>
+        <w:rPr>
+          <w:sz w:val="28"/>
+          <w:szCs w:val="28"/>
+        </w:rPr>
+      </w:pPr>
+      <w:bookmarkStart w:id="23" w:name="_Toc224738238"/>
+      <w:r>
+        <w:rPr>
+          <w:sz w:val="28"/>
+          <w:szCs w:val="28"/>
+        </w:rPr>
         <w:t>4.4 User Interface Design</w:t>
       </w:r>
-      <w:bookmarkEnd w:id="21"/>
+      <w:bookmarkEnd w:id="23"/>
     </w:p>
     <w:p>
       <w:r>
@@ -4631,12 +4281,27 @@
     <w:p>
       <w:pPr>
         <w:pStyle w:val="Heading1"/>
-      </w:pPr>
-      <w:bookmarkStart w:id="22" w:name="_Toc224646169"/>
-      <w:r>
-        <w:t>Chapter 5: Implementation (~2,000 words)</w:t>
-      </w:r>
-      <w:bookmarkEnd w:id="22"/>
+        <w:rPr>
+          <w:sz w:val="32"/>
+          <w:szCs w:val="32"/>
+        </w:rPr>
+      </w:pPr>
+      <w:bookmarkStart w:id="24" w:name="_Toc224738239"/>
+      <w:r>
+        <w:rPr>
+          <w:sz w:val="32"/>
+          <w:szCs w:val="32"/>
+        </w:rPr>
+        <w:t>5.</w:t>
+      </w:r>
+      <w:r>
+        <w:rPr>
+          <w:sz w:val="32"/>
+          <w:szCs w:val="32"/>
+        </w:rPr>
+        <w:t xml:space="preserve"> Implementation (~2,000 words)</w:t>
+      </w:r>
+      <w:bookmarkEnd w:id="24"/>
     </w:p>
     <w:p>
       <w:r>
@@ -4666,12 +4331,20 @@
     <w:p>
       <w:pPr>
         <w:pStyle w:val="Heading2"/>
-      </w:pPr>
-      <w:bookmarkStart w:id="23" w:name="_Toc224646170"/>
-      <w:r>
+        <w:rPr>
+          <w:sz w:val="28"/>
+          <w:szCs w:val="28"/>
+        </w:rPr>
+      </w:pPr>
+      <w:bookmarkStart w:id="25" w:name="_Toc224738240"/>
+      <w:r>
+        <w:rPr>
+          <w:sz w:val="28"/>
+          <w:szCs w:val="28"/>
+        </w:rPr>
         <w:t>5.1 Log Ingestion &amp; Processing</w:t>
       </w:r>
-      <w:bookmarkEnd w:id="23"/>
+      <w:bookmarkEnd w:id="25"/>
     </w:p>
     <w:p>
       <w:r>
@@ -4697,12 +4370,20 @@
     <w:p>
       <w:pPr>
         <w:pStyle w:val="Heading2"/>
-      </w:pPr>
-      <w:bookmarkStart w:id="24" w:name="_Toc224646171"/>
-      <w:r>
+        <w:rPr>
+          <w:sz w:val="28"/>
+          <w:szCs w:val="28"/>
+        </w:rPr>
+      </w:pPr>
+      <w:bookmarkStart w:id="26" w:name="_Toc224738241"/>
+      <w:r>
+        <w:rPr>
+          <w:sz w:val="28"/>
+          <w:szCs w:val="28"/>
+        </w:rPr>
         <w:t>5.2 Data Sanitization</w:t>
       </w:r>
-      <w:bookmarkEnd w:id="24"/>
+      <w:bookmarkEnd w:id="26"/>
     </w:p>
     <w:p>
       <w:r>
@@ -4712,12 +4393,21 @@
     <w:p>
       <w:pPr>
         <w:pStyle w:val="Heading2"/>
-      </w:pPr>
-      <w:bookmarkStart w:id="25" w:name="_Toc224646172"/>
-      <w:r>
+        <w:rPr>
+          <w:sz w:val="28"/>
+          <w:szCs w:val="28"/>
+        </w:rPr>
+      </w:pPr>
+      <w:bookmarkStart w:id="27" w:name="_Toc224738242"/>
+      <w:r>
+        <w:rPr>
+          <w:sz w:val="28"/>
+          <w:szCs w:val="28"/>
+        </w:rPr>
+        <w:lastRenderedPageBreak/>
         <w:t>5.3 AI Integration (The Core Engine)</w:t>
       </w:r>
-      <w:bookmarkEnd w:id="25"/>
+      <w:bookmarkEnd w:id="27"/>
     </w:p>
     <w:p>
       <w:r>
@@ -4727,12 +4417,20 @@
     <w:p>
       <w:pPr>
         <w:pStyle w:val="Heading2"/>
-      </w:pPr>
-      <w:bookmarkStart w:id="26" w:name="_Toc224646173"/>
-      <w:r>
+        <w:rPr>
+          <w:sz w:val="28"/>
+          <w:szCs w:val="28"/>
+        </w:rPr>
+      </w:pPr>
+      <w:bookmarkStart w:id="28" w:name="_Toc224738243"/>
+      <w:r>
+        <w:rPr>
+          <w:sz w:val="28"/>
+          <w:szCs w:val="28"/>
+        </w:rPr>
         <w:t>5.4 Frontend Dashboard</w:t>
       </w:r>
-      <w:bookmarkEnd w:id="26"/>
+      <w:bookmarkEnd w:id="28"/>
     </w:p>
     <w:p>
       <w:r>
@@ -4750,12 +4448,20 @@
     <w:p>
       <w:pPr>
         <w:pStyle w:val="Heading2"/>
-      </w:pPr>
-      <w:bookmarkStart w:id="27" w:name="_Toc224646174"/>
-      <w:r>
+        <w:rPr>
+          <w:sz w:val="28"/>
+          <w:szCs w:val="28"/>
+        </w:rPr>
+      </w:pPr>
+      <w:bookmarkStart w:id="29" w:name="_Toc224738244"/>
+      <w:r>
+        <w:rPr>
+          <w:sz w:val="28"/>
+          <w:szCs w:val="28"/>
+        </w:rPr>
         <w:t>5.5 Overcoming Challenges</w:t>
       </w:r>
-      <w:bookmarkEnd w:id="27"/>
+      <w:bookmarkEnd w:id="29"/>
     </w:p>
     <w:p>
       <w:r>
@@ -4796,12 +4502,27 @@
     <w:p>
       <w:pPr>
         <w:pStyle w:val="Heading1"/>
-      </w:pPr>
-      <w:bookmarkStart w:id="28" w:name="_Toc224646175"/>
-      <w:r>
-        <w:t>Chapter 6: Testing &amp; Evaluation (~1,500 words)</w:t>
-      </w:r>
-      <w:bookmarkEnd w:id="28"/>
+        <w:rPr>
+          <w:sz w:val="32"/>
+          <w:szCs w:val="32"/>
+        </w:rPr>
+      </w:pPr>
+      <w:bookmarkStart w:id="30" w:name="_Toc224738245"/>
+      <w:r>
+        <w:rPr>
+          <w:sz w:val="32"/>
+          <w:szCs w:val="32"/>
+        </w:rPr>
+        <w:t>6.</w:t>
+      </w:r>
+      <w:r>
+        <w:rPr>
+          <w:sz w:val="32"/>
+          <w:szCs w:val="32"/>
+        </w:rPr>
+        <w:t xml:space="preserve"> Testing &amp; Evaluation (~1,500 words)</w:t>
+      </w:r>
+      <w:bookmarkEnd w:id="30"/>
     </w:p>
     <w:p>
       <w:r>
@@ -4831,12 +4552,20 @@
     <w:p>
       <w:pPr>
         <w:pStyle w:val="Heading2"/>
-      </w:pPr>
-      <w:bookmarkStart w:id="29" w:name="_Toc224646176"/>
-      <w:r>
+        <w:rPr>
+          <w:sz w:val="28"/>
+          <w:szCs w:val="28"/>
+        </w:rPr>
+      </w:pPr>
+      <w:bookmarkStart w:id="31" w:name="_Toc224738246"/>
+      <w:r>
+        <w:rPr>
+          <w:sz w:val="28"/>
+          <w:szCs w:val="28"/>
+        </w:rPr>
         <w:t>6.1 Testing Strategy</w:t>
       </w:r>
-      <w:bookmarkEnd w:id="29"/>
+      <w:bookmarkEnd w:id="31"/>
     </w:p>
     <w:p>
       <w:r>
@@ -4846,12 +4575,20 @@
     <w:p>
       <w:pPr>
         <w:pStyle w:val="Heading2"/>
-      </w:pPr>
-      <w:bookmarkStart w:id="30" w:name="_Toc224646177"/>
-      <w:r>
+        <w:rPr>
+          <w:sz w:val="28"/>
+          <w:szCs w:val="28"/>
+        </w:rPr>
+      </w:pPr>
+      <w:bookmarkStart w:id="32" w:name="_Toc224738247"/>
+      <w:r>
+        <w:rPr>
+          <w:sz w:val="28"/>
+          <w:szCs w:val="28"/>
+        </w:rPr>
         <w:t>6.2 Security Testing</w:t>
       </w:r>
-      <w:bookmarkEnd w:id="30"/>
+      <w:bookmarkEnd w:id="32"/>
     </w:p>
     <w:p>
       <w:r>
@@ -4869,13 +4606,20 @@
     <w:p>
       <w:pPr>
         <w:pStyle w:val="Heading2"/>
-      </w:pPr>
-      <w:bookmarkStart w:id="31" w:name="_Toc224646178"/>
-      <w:r>
-        <w:lastRenderedPageBreak/>
+        <w:rPr>
+          <w:sz w:val="28"/>
+          <w:szCs w:val="28"/>
+        </w:rPr>
+      </w:pPr>
+      <w:bookmarkStart w:id="33" w:name="_Toc224738248"/>
+      <w:r>
+        <w:rPr>
+          <w:sz w:val="28"/>
+          <w:szCs w:val="28"/>
+        </w:rPr>
         <w:t>6.3 User Acceptance Testing (UAT)</w:t>
       </w:r>
-      <w:bookmarkEnd w:id="31"/>
+      <w:bookmarkEnd w:id="33"/>
     </w:p>
     <w:p>
       <w:r>
@@ -4895,12 +4639,20 @@
     <w:p>
       <w:pPr>
         <w:pStyle w:val="Heading2"/>
-      </w:pPr>
-      <w:bookmarkStart w:id="32" w:name="_Toc224646179"/>
-      <w:r>
+        <w:rPr>
+          <w:sz w:val="28"/>
+          <w:szCs w:val="28"/>
+        </w:rPr>
+      </w:pPr>
+      <w:bookmarkStart w:id="34" w:name="_Toc224738249"/>
+      <w:r>
+        <w:rPr>
+          <w:sz w:val="28"/>
+          <w:szCs w:val="28"/>
+        </w:rPr>
         <w:t>6.4 Performance Evaluation</w:t>
       </w:r>
-      <w:bookmarkEnd w:id="32"/>
+      <w:bookmarkEnd w:id="34"/>
     </w:p>
     <w:p>
       <w:r>
@@ -4918,12 +4670,27 @@
     <w:p>
       <w:pPr>
         <w:pStyle w:val="Heading1"/>
-      </w:pPr>
-      <w:bookmarkStart w:id="33" w:name="_Toc224646180"/>
-      <w:r>
-        <w:t>Chapter 7: Conclusion &amp; Future Work (~1,000 words)</w:t>
-      </w:r>
-      <w:bookmarkEnd w:id="33"/>
+        <w:rPr>
+          <w:sz w:val="32"/>
+          <w:szCs w:val="32"/>
+        </w:rPr>
+      </w:pPr>
+      <w:bookmarkStart w:id="35" w:name="_Toc224738250"/>
+      <w:r>
+        <w:rPr>
+          <w:sz w:val="32"/>
+          <w:szCs w:val="32"/>
+        </w:rPr>
+        <w:t>7.</w:t>
+      </w:r>
+      <w:r>
+        <w:rPr>
+          <w:sz w:val="32"/>
+          <w:szCs w:val="32"/>
+        </w:rPr>
+        <w:t xml:space="preserve"> Conclusion &amp; Future Work (~1,000 words)</w:t>
+      </w:r>
+      <w:bookmarkEnd w:id="35"/>
     </w:p>
     <w:p>
       <w:r>
@@ -4937,12 +4704,20 @@
     <w:p>
       <w:pPr>
         <w:pStyle w:val="Heading2"/>
-      </w:pPr>
-      <w:bookmarkStart w:id="34" w:name="_Toc224646181"/>
-      <w:r>
+        <w:rPr>
+          <w:sz w:val="28"/>
+          <w:szCs w:val="28"/>
+        </w:rPr>
+      </w:pPr>
+      <w:bookmarkStart w:id="36" w:name="_Toc224738251"/>
+      <w:r>
+        <w:rPr>
+          <w:sz w:val="28"/>
+          <w:szCs w:val="28"/>
+        </w:rPr>
         <w:t>7.1 Project Summary</w:t>
       </w:r>
-      <w:bookmarkEnd w:id="34"/>
+      <w:bookmarkEnd w:id="36"/>
     </w:p>
     <w:p>
       <w:r>
@@ -4952,12 +4727,20 @@
     <w:p>
       <w:pPr>
         <w:pStyle w:val="Heading2"/>
-      </w:pPr>
-      <w:bookmarkStart w:id="35" w:name="_Toc224646182"/>
-      <w:r>
+        <w:rPr>
+          <w:sz w:val="28"/>
+          <w:szCs w:val="28"/>
+        </w:rPr>
+      </w:pPr>
+      <w:bookmarkStart w:id="37" w:name="_Toc224738252"/>
+      <w:r>
+        <w:rPr>
+          <w:sz w:val="28"/>
+          <w:szCs w:val="28"/>
+        </w:rPr>
         <w:t>7.2 Critical Evaluation &amp; Limitations</w:t>
       </w:r>
-      <w:bookmarkEnd w:id="35"/>
+      <w:bookmarkEnd w:id="37"/>
     </w:p>
     <w:p>
       <w:r>
@@ -4967,12 +4750,20 @@
     <w:p>
       <w:pPr>
         <w:pStyle w:val="Heading2"/>
-      </w:pPr>
-      <w:bookmarkStart w:id="36" w:name="_Toc224646183"/>
-      <w:r>
+        <w:rPr>
+          <w:sz w:val="28"/>
+          <w:szCs w:val="28"/>
+        </w:rPr>
+      </w:pPr>
+      <w:bookmarkStart w:id="38" w:name="_Toc224738253"/>
+      <w:r>
+        <w:rPr>
+          <w:sz w:val="28"/>
+          <w:szCs w:val="28"/>
+        </w:rPr>
         <w:t>7.3 Future Enhancements</w:t>
       </w:r>
-      <w:bookmarkEnd w:id="36"/>
+      <w:bookmarkEnd w:id="38"/>
     </w:p>
     <w:p>
       <w:r>
@@ -5004,12 +4795,21 @@
     <w:p>
       <w:pPr>
         <w:pStyle w:val="Heading2"/>
-      </w:pPr>
-      <w:bookmarkStart w:id="37" w:name="_Toc224646184"/>
-      <w:r>
+        <w:rPr>
+          <w:sz w:val="28"/>
+          <w:szCs w:val="28"/>
+        </w:rPr>
+      </w:pPr>
+      <w:bookmarkStart w:id="39" w:name="_Toc224738254"/>
+      <w:r>
+        <w:rPr>
+          <w:sz w:val="28"/>
+          <w:szCs w:val="28"/>
+        </w:rPr>
+        <w:lastRenderedPageBreak/>
         <w:t>7.4 Final Thoughts</w:t>
       </w:r>
-      <w:bookmarkEnd w:id="37"/>
+      <w:bookmarkEnd w:id="39"/>
     </w:p>
     <w:p>
       <w:r>
@@ -5019,38 +4819,78 @@
     <w:p>
       <w:r>
         <w:pict w14:anchorId="7999752A">
-          <v:rect id="_x0000_i1038" style="width:0;height:1.5pt" o:hralign="center" o:hrstd="t" o:hr="t" fillcolor="#a0a0a0" stroked="f"/>
+          <v:rect id="_x0000_i1026" style="width:0;height:1.5pt" o:hralign="center" o:hrstd="t" o:hr="t" fillcolor="#a0a0a0" stroked="f"/>
         </w:pict>
       </w:r>
     </w:p>
     <w:p>
-      <w:bookmarkStart w:id="38" w:name="_Toc224646185"/>
+      <w:pPr>
+        <w:rPr>
+          <w:sz w:val="32"/>
+          <w:szCs w:val="32"/>
+        </w:rPr>
+      </w:pPr>
+      <w:bookmarkStart w:id="40" w:name="_Toc224738255"/>
       <w:r>
         <w:rPr>
           <w:rStyle w:val="Heading1Char"/>
+          <w:sz w:val="32"/>
+          <w:szCs w:val="32"/>
         </w:rPr>
         <w:t>References / Bibliography</w:t>
       </w:r>
-      <w:bookmarkEnd w:id="38"/>
-      <w:r>
+      <w:bookmarkEnd w:id="40"/>
+      <w:r>
+        <w:rPr>
+          <w:sz w:val="32"/>
+          <w:szCs w:val="32"/>
+        </w:rPr>
         <w:t xml:space="preserve"> </w:t>
       </w:r>
     </w:p>
     <w:p>
       <w:r>
+        <w:t xml:space="preserve">[1] </w:t>
+      </w:r>
+      <w:hyperlink r:id="rId8" w:history="1">
+        <w:r>
+          <w:rPr>
+            <w:rStyle w:val="Hyperlink"/>
+          </w:rPr>
+          <w:t>https://www.hiscoxgroup.com/news/press-releases/2025/29-09-25</w:t>
+        </w:r>
+      </w:hyperlink>
+      <w:r>
+        <w:t xml:space="preserve"> </w:t>
+      </w:r>
+    </w:p>
+    <w:p>
+      <w:r>
         <w:t>(Use Harvard or IEEE format, whichever your university prefers).</w:t>
       </w:r>
     </w:p>
     <w:p>
       <w:pPr>
         <w:pStyle w:val="Heading1"/>
-      </w:pPr>
-      <w:bookmarkStart w:id="39" w:name="_Toc224646186"/>
-      <w:r>
+        <w:rPr>
+          <w:sz w:val="32"/>
+          <w:szCs w:val="32"/>
+        </w:rPr>
+      </w:pPr>
+      <w:bookmarkStart w:id="41" w:name="_Toc224738256"/>
+      <w:r>
+        <w:rPr>
+          <w:sz w:val="32"/>
+          <w:szCs w:val="32"/>
+        </w:rPr>
         <w:t>Appendices:</w:t>
       </w:r>
-      <w:bookmarkEnd w:id="39"/>
-      <w:r>
+      <w:bookmarkEnd w:id="41"/>
+      <w:r>
+        <w:rPr>
+          <w:sz w:val="32"/>
+          <w:szCs w:val="32"/>
+        </w:rPr>
         <w:t xml:space="preserve"> </w:t>
       </w:r>
     </w:p>
@@ -5155,7 +4995,6 @@
           <w:b/>
           <w:bCs/>
         </w:rPr>
-        <w:lastRenderedPageBreak/>
         <w:t>Justify everything:</w:t>
       </w:r>
       <w:r>
@@ -5196,6 +5035,7 @@
     </w:p>
     <w:p/>
     <w:sectPr>
+      <w:footerReference w:type="default" r:id="rId9"/>
       <w:pgSz w:w="11906" w:h="16838"/>
       <w:pgMar w:top="1440" w:right="1440" w:bottom="1440" w:left="1440" w:header="708" w:footer="708" w:gutter="0"/>
       <w:pgNumType w:start="0"/>
@@ -5207,8 +5047,115 @@
 </w:document>
 </file>
 
+<file path=word/endnotes.xml><?xml version="1.0" encoding="utf-8"?>
+<w:endnotes xmlns:wpc="http://schemas.microsoft.com/office/word/2010/wordprocessingCanvas" xmlns:cx="http://schemas.microsoft.com/office/drawing/2014/chartex" xmlns:cx1="http://schemas.microsoft.com/office/drawing/2015/9/8/chartex" xmlns:cx2="http://schemas.microsoft.com/office/drawing/2015/10/21/chartex" xmlns:cx3="http://schemas.microsoft.com/office/drawing/2016/5/9/chartex" xmlns:cx4="http://schemas.microsoft.com/office/drawing/2016/5/10/chartex" xmlns:cx5="http://schemas.microsoft.com/office/drawing/2016/5/11/chartex" xmlns:cx6="http://schemas.microsoft.com/office/drawing/2016/5/12/chartex" xmlns:cx7="http://schemas.microsoft.com/office/drawing/2016/5/13/chartex" xmlns:cx8="http://schemas.microsoft.com/office/drawing/2016/5/14/chartex" xmlns:mc="http://schemas.openxmlformats.org/markup-compatibility/2006" xmlns:aink="http://schemas.microsoft.com/office/drawing/2016/ink" xmlns:am3d="http://schemas.microsoft.com/office/drawing/2017/model3d" xmlns:o="urn:schemas-microsoft-com:office:office" xmlns:oel="http://schemas.microsoft.com/office/2019/extlst" xmlns:r="http://schemas.openxmlformats.org/officeDocument/2006/relationships" xmlns:m="http://schemas.openxmlformats.org/officeDocument/2006/math" xmlns:v="urn:schemas-microsoft-com:vml" xmlns:wp14="http://schemas.microsoft.com/office/word/2010/wordprocessingDrawing" xmlns:wp="http://schemas.openxmlformats.org/drawingml/2006/wordprocessingDrawing" xmlns:w10="urn:schemas-microsoft-com:office:word" xmlns:w="http://schemas.openxmlformats.org/wordprocessingml/2006/main" xmlns:w14="http://schemas.microsoft.com/office/word/2010/wordml" xmlns:w15="http://schemas.microsoft.com/office/word/2012/wordml" xmlns:w16cex="http://schemas.microsoft.com/office/word/2018/wordml/cex" xmlns:w16cid="http://schemas.microsoft.com/office/word/2016/wordml/cid" xmlns:w16="http://schemas.microsoft.com/office/word/2018/wordml" xmlns:w16du="http://schemas.microsoft.com/office/word/2023/wordml/word16du" xmlns:w16sdtdh="http://schemas.microsoft.com/office/word/2020/wordml/sdtdatahash" xmlns:w16sdtfl="http://schemas.microsoft.com/office/word/2024/wordml/sdtformatlock" xmlns:w16se="http://schemas.microsoft.com/office/word/2015/wordml/symex" xmlns:wpg="http://schemas.microsoft.com/office/word/2010/wordprocessingGroup" xmlns:wpi="http://schemas.microsoft.com/office/word/2010/wordprocessingInk" xmlns:wne="http://schemas.microsoft.com/office/word/2006/wordml" xmlns:wps="http://schemas.microsoft.com/office/word/2010/wordprocessingShape" mc:Ignorable="w14 w15 w16se w16cid w16 w16cex w16sdtdh w16sdtfl w16du wp14">
+  <w:endnote w:type="separator" w:id="-1">
+    <w:p>
+      <w:pPr>
+        <w:spacing w:after="0" w:line="240" w:lineRule="auto"/>
+      </w:pPr>
+      <w:r>
+        <w:separator/>
+      </w:r>
+    </w:p>
+  </w:endnote>
+  <w:endnote w:type="continuationSeparator" w:id="0">
+    <w:p>
+      <w:pPr>
+        <w:spacing w:after="0" w:line="240" w:lineRule="auto"/>
+      </w:pPr>
+      <w:r>
+        <w:continuationSeparator/>
+      </w:r>
+    </w:p>
+  </w:endnote>
+</w:endnotes>
+</file>
+
+<file path=word/footer1.xml><?xml version="1.0" encoding="utf-8"?>
+<w:ftr xmlns:wpc="http://schemas.microsoft.com/office/word/2010/wordprocessingCanvas" xmlns:cx="http://schemas.microsoft.com/office/drawing/2014/chartex" xmlns:cx1="http://schemas.microsoft.com/office/drawing/2015/9/8/chartex" xmlns:cx2="http://schemas.microsoft.com/office/drawing/2015/10/21/chartex" xmlns:cx3="http://schemas.microsoft.com/office/drawing/2016/5/9/chartex" xmlns:cx4="http://schemas.microsoft.com/office/drawing/2016/5/10/chartex" xmlns:cx5="http://schemas.microsoft.com/office/drawing/2016/5/11/chartex" xmlns:cx6="http://schemas.microsoft.com/office/drawing/2016/5/12/chartex" xmlns:cx7="http://schemas.microsoft.com/office/drawing/2016/5/13/chartex" xmlns:cx8="http://schemas.microsoft.com/office/drawing/2016/5/14/chartex" xmlns:mc="http://schemas.openxmlformats.org/markup-compatibility/2006" xmlns:aink="http://schemas.microsoft.com/office/drawing/2016/ink" xmlns:am3d="http://schemas.microsoft.com/office/drawing/2017/model3d" xmlns:o="urn:schemas-microsoft-com:office:office" xmlns:oel="http://schemas.microsoft.com/office/2019/extlst" xmlns:r="http://schemas.openxmlformats.org/officeDocument/2006/relationships" xmlns:m="http://schemas.openxmlformats.org/officeDocument/2006/math" xmlns:v="urn:schemas-microsoft-com:vml" xmlns:wp14="http://schemas.microsoft.com/office/word/2010/wordprocessingDrawing" xmlns:wp="http://schemas.openxmlformats.org/drawingml/2006/wordprocessingDrawing" xmlns:w10="urn:schemas-microsoft-com:office:word" xmlns:w="http://schemas.openxmlformats.org/wordprocessingml/2006/main" xmlns:w14="http://schemas.microsoft.com/office/word/2010/wordml" xmlns:w15="http://schemas.microsoft.com/office/word/2012/wordml" xmlns:w16cex="http://schemas.microsoft.com/office/word/2018/wordml/cex" xmlns:w16cid="http://schemas.microsoft.com/office/word/2016/wordml/cid" xmlns:w16="http://schemas.microsoft.com/office/word/2018/wordml" xmlns:w16du="http://schemas.microsoft.com/office/word/2023/wordml/word16du" xmlns:w16sdtdh="http://schemas.microsoft.com/office/word/2020/wordml/sdtdatahash" xmlns:w16sdtfl="http://schemas.microsoft.com/office/word/2024/wordml/sdtformatlock" xmlns:w16se="http://schemas.microsoft.com/office/word/2015/wordml/symex" xmlns:wpg="http://schemas.microsoft.com/office/word/2010/wordprocessingGroup" xmlns:wpi="http://schemas.microsoft.com/office/word/2010/wordprocessingInk" xmlns:wne="http://schemas.microsoft.com/office/word/2006/wordml" xmlns:wps="http://schemas.microsoft.com/office/word/2010/wordprocessingShape" mc:Ignorable="w14 w15 w16se w16cid w16 w16cex w16sdtdh w16sdtfl w16du wp14">
+  <w:sdt>
+    <w:sdtPr>
+      <w:id w:val="837965528"/>
+      <w:docPartObj>
+        <w:docPartGallery w:val="Page Numbers (Bottom of Page)"/>
+        <w:docPartUnique/>
+      </w:docPartObj>
+    </w:sdtPr>
+    <w:sdtEndPr>
+      <w:rPr>
+        <w:noProof/>
+      </w:rPr>
+    </w:sdtEndPr>
+    <w:sdtContent>
+      <w:p>
+        <w:pPr>
+          <w:pStyle w:val="Footer"/>
+        </w:pPr>
+        <w:r>
+          <w:fldChar w:fldCharType="begin"/>
+        </w:r>
+        <w:r>
+          <w:instrText xml:space="preserve"> PAGE   \* MERGEFORMAT </w:instrText>
+        </w:r>
+        <w:r>
+          <w:fldChar w:fldCharType="separate"/>
+        </w:r>
+        <w:r>
+          <w:rPr>
+            <w:noProof/>
+          </w:rPr>
+          <w:t>2</w:t>
+        </w:r>
+        <w:r>
+          <w:rPr>
+            <w:noProof/>
+          </w:rPr>
+          <w:fldChar w:fldCharType="end"/>
+        </w:r>
+      </w:p>
+    </w:sdtContent>
+  </w:sdt>
+  <w:p>
+    <w:pPr>
+      <w:pStyle w:val="Footer"/>
+    </w:pPr>
+  </w:p>
+</w:ftr>
+</file>
+
+<file path=word/footnotes.xml><?xml version="1.0" encoding="utf-8"?>
+<w:footnotes xmlns:wpc="http://schemas.microsoft.com/office/word/2010/wordprocessingCanvas" xmlns:cx="http://schemas.microsoft.com/office/drawing/2014/chartex" xmlns:cx1="http://schemas.microsoft.com/office/drawing/2015/9/8/chartex" xmlns:cx2="http://schemas.microsoft.com/office/drawing/2015/10/21/chartex" xmlns:cx3="http://schemas.microsoft.com/office/drawing/2016/5/9/chartex" xmlns:cx4="http://schemas.microsoft.com/office/drawing/2016/5/10/chartex" xmlns:cx5="http://schemas.microsoft.com/office/drawing/2016/5/11/chartex" xmlns:cx6="http://schemas.microsoft.com/office/drawing/2016/5/12/chartex" xmlns:cx7="http://schemas.microsoft.com/office/drawing/2016/5/13/chartex" xmlns:cx8="http://schemas.microsoft.com/office/drawing/2016/5/14/chartex" xmlns:mc="http://schemas.openxmlformats.org/markup-compatibility/2006" xmlns:aink="http://schemas.microsoft.com/office/drawing/2016/ink" xmlns:am3d="http://schemas.microsoft.com/office/drawing/2017/model3d" xmlns:o="urn:schemas-microsoft-com:office:office" xmlns:oel="http://schemas.microsoft.com/office/2019/extlst" xmlns:r="http://schemas.openxmlformats.org/officeDocument/2006/relationships" xmlns:m="http://schemas.openxmlformats.org/officeDocument/2006/math" xmlns:v="urn:schemas-microsoft-com:vml" xmlns:wp14="http://schemas.microsoft.com/office/word/2010/wordprocessingDrawing" xmlns:wp="http://schemas.openxmlformats.org/drawingml/2006/wordprocessingDrawing" xmlns:w10="urn:schemas-microsoft-com:office:word" xmlns:w="http://schemas.openxmlformats.org/wordprocessingml/2006/main" xmlns:w14="http://schemas.microsoft.com/office/word/2010/wordml" xmlns:w15="http://schemas.microsoft.com/office/word/2012/wordml" xmlns:w16cex="http://schemas.microsoft.com/office/word/2018/wordml/cex" xmlns:w16cid="http://schemas.microsoft.com/office/word/2016/wordml/cid" xmlns:w16="http://schemas.microsoft.com/office/word/2018/wordml" xmlns:w16du="http://schemas.microsoft.com/office/word/2023/wordml/word16du" xmlns:w16sdtdh="http://schemas.microsoft.com/office/word/2020/wordml/sdtdatahash" xmlns:w16sdtfl="http://schemas.microsoft.com/office/word/2024/wordml/sdtformatlock" xmlns:w16se="http://schemas.microsoft.com/office/word/2015/wordml/symex" xmlns:wpg="http://schemas.microsoft.com/office/word/2010/wordprocessingGroup" xmlns:wpi="http://schemas.microsoft.com/office/word/2010/wordprocessingInk" xmlns:wne="http://schemas.microsoft.com/office/word/2006/wordml" xmlns:wps="http://schemas.microsoft.com/office/word/2010/wordprocessingShape" mc:Ignorable="w14 w15 w16se w16cid w16 w16cex w16sdtdh w16sdtfl w16du wp14">
+  <w:footnote w:type="separator" w:id="-1">
+    <w:p>
+      <w:pPr>
+        <w:spacing w:after="0" w:line="240" w:lineRule="auto"/>
+      </w:pPr>
+      <w:r>
+        <w:separator/>
+      </w:r>
+    </w:p>
+  </w:footnote>
+  <w:footnote w:type="continuationSeparator" w:id="0">
+    <w:p>
+      <w:pPr>
+        <w:spacing w:after="0" w:line="240" w:lineRule="auto"/>
+      </w:pPr>
+      <w:r>
+        <w:continuationSeparator/>
+      </w:r>
+    </w:p>
+  </w:footnote>
+</w:footnotes>
+</file>
+
 <file path=word/numbering.xml><?xml version="1.0" encoding="utf-8"?>
 <w:numbering xmlns:wpc="http://schemas.microsoft.com/office/word/2010/wordprocessingCanvas" xmlns:cx="http://schemas.microsoft.com/office/drawing/2014/chartex" xmlns:cx1="http://schemas.microsoft.com/office/drawing/2015/9/8/chartex" xmlns:cx2="http://schemas.microsoft.com/office/drawing/2015/10/21/chartex" xmlns:cx3="http://schemas.microsoft.com/office/drawing/2016/5/9/chartex" xmlns:cx4="http://schemas.microsoft.com/office/drawing/2016/5/10/chartex" xmlns:cx5="http://schemas.microsoft.com/office/drawing/2016/5/11/chartex" xmlns:cx6="http://schemas.microsoft.com/office/drawing/2016/5/12/chartex" xmlns:cx7="http://schemas.microsoft.com/office/drawing/2016/5/13/chartex" xmlns:cx8="http://schemas.microsoft.com/office/drawing/2016/5/14/chartex" xmlns:mc="http://schemas.openxmlformats.org/markup-compatibility/2006" xmlns:aink="http://schemas.microsoft.com/office/drawing/2016/ink" xmlns:am3d="http://schemas.microsoft.com/office/drawing/2017/model3d" xmlns:o="urn:schemas-microsoft-com:office:office" xmlns:oel="http://schemas.microsoft.com/office/2019/extlst" xmlns:r="http://schemas.openxmlformats.org/officeDocument/2006/relationships" xmlns:m="http://schemas.openxmlformats.org/officeDocument/2006/math" xmlns:v="urn:schemas-microsoft-com:vml" xmlns:wp14="http://schemas.microsoft.com/office/word/2010/wordprocessingDrawing" xmlns:wp="http://schemas.openxmlformats.org/drawingml/2006/wordprocessingDrawing" xmlns:w10="urn:schemas-microsoft-com:office:word" xmlns:w="http://schemas.openxmlformats.org/wordprocessingml/2006/main" xmlns:w14="http://schemas.microsoft.com/office/word/2010/wordml" xmlns:w15="http://schemas.microsoft.com/office/word/2012/wordml" xmlns:w16cex="http://schemas.microsoft.com/office/word/2018/wordml/cex" xmlns:w16cid="http://schemas.microsoft.com/office/word/2016/wordml/cid" xmlns:w16="http://schemas.microsoft.com/office/word/2018/wordml" xmlns:w16du="http://schemas.microsoft.com/office/word/2023/wordml/word16du" xmlns:w16sdtdh="http://schemas.microsoft.com/office/word/2020/wordml/sdtdatahash" xmlns:w16sdtfl="http://schemas.microsoft.com/office/word/2024/wordml/sdtformatlock" xmlns:w16se="http://schemas.microsoft.com/office/word/2015/wordml/symex" xmlns:wpg="http://schemas.microsoft.com/office/word/2010/wordprocessingGroup" xmlns:wpi="http://schemas.microsoft.com/office/word/2010/wordprocessingInk" xmlns:wne="http://schemas.microsoft.com/office/word/2006/wordml" xmlns:wps="http://schemas.microsoft.com/office/word/2010/wordprocessingShape" mc:Ignorable="w14 w15 w16se w16cid w16 w16cex w16sdtdh w16sdtfl w16du wp14">
+  <w:numPicBullet w:numPicBulletId="0">
+    <w:pict>
+      <v:rect id="_x0000_i1025" style="width:0;height:1.5pt" o:hralign="center" o:bullet="t" o:hrstd="t" o:hr="t" fillcolor="#a0a0a0" stroked="f"/>
+    </w:pict>
+  </w:numPicBullet>
   <w:abstractNum w:abstractNumId="0" w15:restartNumberingAfterBreak="0">
     <w:nsid w:val="0162472B"/>
     <w:multiLevelType w:val="multilevel"/>
@@ -8214,6 +8161,62 @@
       <w:ind w:left="220"/>
     </w:pPr>
   </w:style>
+  <w:style w:type="paragraph" w:styleId="Header">
+    <w:name w:val="header"/>
+    <w:basedOn w:val="Normal"/>
+    <w:link w:val="HeaderChar"/>
+    <w:uiPriority w:val="99"/>
+    <w:unhideWhenUsed/>
+    <w:rsid w:val="00392D93"/>
+    <w:pPr>
+      <w:tabs>
+        <w:tab w:val="center" w:pos="4513"/>
+        <w:tab w:val="right" w:pos="9026"/>
+      </w:tabs>
+      <w:spacing w:after="0" w:line="240" w:lineRule="auto"/>
+    </w:pPr>
+  </w:style>
+  <w:style w:type="character" w:customStyle="1" w:styleId="HeaderChar">
+    <w:name w:val="Header Char"/>
+    <w:basedOn w:val="DefaultParagraphFont"/>
+    <w:link w:val="Header"/>
+    <w:uiPriority w:val="99"/>
+    <w:rsid w:val="00392D93"/>
+  </w:style>
+  <w:style w:type="paragraph" w:styleId="Footer">
+    <w:name w:val="footer"/>
+    <w:basedOn w:val="Normal"/>
+    <w:link w:val="FooterChar"/>
+    <w:uiPriority w:val="99"/>
+    <w:unhideWhenUsed/>
+    <w:rsid w:val="00392D93"/>
+    <w:pPr>
+      <w:tabs>
+        <w:tab w:val="center" w:pos="4513"/>
+        <w:tab w:val="right" w:pos="9026"/>
+      </w:tabs>
+      <w:spacing w:after="0" w:line="240" w:lineRule="auto"/>
+    </w:pPr>
+  </w:style>
+  <w:style w:type="character" w:customStyle="1" w:styleId="FooterChar">
+    <w:name w:val="Footer Char"/>
+    <w:basedOn w:val="DefaultParagraphFont"/>
+    <w:link w:val="Footer"/>
+    <w:uiPriority w:val="99"/>
+    <w:rsid w:val="00392D93"/>
+  </w:style>
+  <w:style w:type="character" w:styleId="UnresolvedMention">
+    <w:name w:val="Unresolved Mention"/>
+    <w:basedOn w:val="DefaultParagraphFont"/>
+    <w:uiPriority w:val="99"/>
+    <w:semiHidden/>
+    <w:unhideWhenUsed/>
+    <w:rsid w:val="00517EF1"/>
+    <w:rPr>
+      <w:color w:val="605E5C"/>
+      <w:shd w:val="clear" w:color="auto" w:fill="E1DFDD"/>
+    </w:rPr>
+  </w:style>
 </w:styles>
 </file>
 

</xml_diff>